<commit_message>
feat: hoan thien toan dien ho so nghiem thu, bao cao pdf 35 trang, video demo va minh chung thuc nghiem
</commit_message>
<xml_diff>
--- a/report/BaCaoTienDo_BigData_Nhom9.docx
+++ b/report/BaCaoTienDo_BigData_Nhom9.docx
@@ -4437,6 +4437,4310 @@
           <w:lang w:val="vi-VN"/>
         </w:rPr>
       </w:pPr>
+    </w:p>
+    <w:p>
+      <w:pPr>
+        <w:pageBreakBefore/>
+        <w:spacing w:before="280" w:after="80"/>
+      </w:pPr>
+      <w:r>
+        <w:rPr>
+          <w:rFonts w:ascii="Arial" w:hAnsi="Arial"/>
+          <w:b/>
+          <w:color w:val="000000"/>
+          <w:sz w:val="26"/>
+        </w:rPr>
+        <w:t>BẢNG THEO DÕI VÀ XỬ LÝ LỖI KỸ THUẬT (BUG &amp; TROUBLESHOOTING LOG)</w:t>
+      </w:r>
+    </w:p>
+    <w:p>
+      <w:r>
+        <w:t>Trong suốt quá trình triển khai hệ thống phân tích Big Data trên 1.6 triệu dòng dữ liệu Sentiment140, nhóm đã ghi nhận, phân tích nguyên nhân và xử lý triệt để 7 sự cố kỹ thuật trọng tâm:</w:t>
+      </w:r>
+    </w:p>
+    <w:tbl>
+      <w:tblPr>
+        <w:tblW w:type="auto" w:w="0"/>
+        <w:jc w:val="center"/>
+        <w:tblLook w:firstColumn="1" w:firstRow="1" w:lastColumn="0" w:lastRow="0" w:noHBand="0" w:noVBand="1" w:val="04A0"/>
+        <w:tblBorders>
+          <w:top w:val="single" w:sz="4" w:space="0" w:color="000000"/>
+          <w:bottom w:val="single" w:sz="4" w:space="0" w:color="000000"/>
+          <w:left w:val="single" w:sz="4" w:space="0" w:color="000000"/>
+          <w:right w:val="single" w:sz="4" w:space="0" w:color="000000"/>
+          <w:insideH w:val="single" w:sz="4" w:space="0" w:color="000000"/>
+          <w:insideV w:val="single" w:sz="4" w:space="0" w:color="000000"/>
+        </w:tblBorders>
+      </w:tblPr>
+      <w:tblGrid>
+        <w:gridCol w:w="1881"/>
+        <w:gridCol w:w="1881"/>
+        <w:gridCol w:w="1881"/>
+        <w:gridCol w:w="1881"/>
+        <w:gridCol w:w="1881"/>
+      </w:tblGrid>
+      <w:tr>
+        <w:trPr>
+          <w:tblHeader/>
+          <w:cantSplit/>
+        </w:trPr>
+        <w:tc>
+          <w:tcPr>
+            <w:tcW w:type="dxa" w:w="720"/>
+            <w:shd w:fill="FFFFFF"/>
+            <w:tcMar>
+              <w:top w:w="120" w:type="dxa"/>
+              <w:bottom w:w="120" w:type="dxa"/>
+              <w:left w:w="140" w:type="dxa"/>
+              <w:right w:w="140" w:type="dxa"/>
+            </w:tcMar>
+          </w:tcPr>
+          <w:p>
+            <w:pPr>
+              <w:spacing w:before="0" w:after="0" w:line="276" w:lineRule="auto"/>
+              <w:jc w:val="center"/>
+            </w:pPr>
+            <w:r>
+              <w:rPr>
+                <w:rFonts w:ascii="Arial" w:hAnsi="Arial"/>
+                <w:b/>
+                <w:color w:val="000000"/>
+                <w:sz w:val="19"/>
+              </w:rPr>
+              <w:t>STT</w:t>
+            </w:r>
+          </w:p>
+        </w:tc>
+        <w:tc>
+          <w:tcPr>
+            <w:tcW w:type="dxa" w:w="2160"/>
+            <w:shd w:fill="FFFFFF"/>
+            <w:tcMar>
+              <w:top w:w="120" w:type="dxa"/>
+              <w:bottom w:w="120" w:type="dxa"/>
+              <w:left w:w="140" w:type="dxa"/>
+              <w:right w:w="140" w:type="dxa"/>
+            </w:tcMar>
+          </w:tcPr>
+          <w:p>
+            <w:pPr>
+              <w:spacing w:before="0" w:after="0" w:line="276" w:lineRule="auto"/>
+              <w:jc w:val="center"/>
+            </w:pPr>
+            <w:r>
+              <w:rPr>
+                <w:rFonts w:ascii="Arial" w:hAnsi="Arial"/>
+                <w:b/>
+                <w:color w:val="000000"/>
+                <w:sz w:val="19"/>
+              </w:rPr>
+              <w:t>Hệ thống / Mã lỗi</w:t>
+            </w:r>
+          </w:p>
+        </w:tc>
+        <w:tc>
+          <w:tcPr>
+            <w:tcW w:type="dxa" w:w="2304"/>
+            <w:shd w:fill="FFFFFF"/>
+            <w:tcMar>
+              <w:top w:w="120" w:type="dxa"/>
+              <w:bottom w:w="120" w:type="dxa"/>
+              <w:left w:w="140" w:type="dxa"/>
+              <w:right w:w="140" w:type="dxa"/>
+            </w:tcMar>
+          </w:tcPr>
+          <w:p>
+            <w:pPr>
+              <w:spacing w:before="0" w:after="0" w:line="276" w:lineRule="auto"/>
+              <w:jc w:val="center"/>
+            </w:pPr>
+            <w:r>
+              <w:rPr>
+                <w:rFonts w:ascii="Arial" w:hAnsi="Arial"/>
+                <w:b/>
+                <w:color w:val="000000"/>
+                <w:sz w:val="19"/>
+              </w:rPr>
+              <w:t>Triệu chứng &amp; Nguyên nhân</w:t>
+            </w:r>
+          </w:p>
+        </w:tc>
+        <w:tc>
+          <w:tcPr>
+            <w:tcW w:type="dxa" w:w="2736"/>
+            <w:shd w:fill="FFFFFF"/>
+            <w:tcMar>
+              <w:top w:w="120" w:type="dxa"/>
+              <w:bottom w:w="120" w:type="dxa"/>
+              <w:left w:w="140" w:type="dxa"/>
+              <w:right w:w="140" w:type="dxa"/>
+            </w:tcMar>
+          </w:tcPr>
+          <w:p>
+            <w:pPr>
+              <w:spacing w:before="0" w:after="0" w:line="276" w:lineRule="auto"/>
+              <w:jc w:val="center"/>
+            </w:pPr>
+            <w:r>
+              <w:rPr>
+                <w:rFonts w:ascii="Arial" w:hAnsi="Arial"/>
+                <w:b/>
+                <w:color w:val="000000"/>
+                <w:sz w:val="19"/>
+              </w:rPr>
+              <w:t>Giải pháp kỹ thuật khắc phục</w:t>
+            </w:r>
+          </w:p>
+        </w:tc>
+        <w:tc>
+          <w:tcPr>
+            <w:tcW w:type="dxa" w:w="1440"/>
+            <w:shd w:fill="FFFFFF"/>
+            <w:tcMar>
+              <w:top w:w="120" w:type="dxa"/>
+              <w:bottom w:w="120" w:type="dxa"/>
+              <w:left w:w="140" w:type="dxa"/>
+              <w:right w:w="140" w:type="dxa"/>
+            </w:tcMar>
+          </w:tcPr>
+          <w:p>
+            <w:pPr>
+              <w:spacing w:before="0" w:after="0" w:line="276" w:lineRule="auto"/>
+              <w:jc w:val="center"/>
+            </w:pPr>
+            <w:r>
+              <w:rPr>
+                <w:rFonts w:ascii="Arial" w:hAnsi="Arial"/>
+                <w:b/>
+                <w:color w:val="000000"/>
+                <w:sz w:val="19"/>
+              </w:rPr>
+              <w:t>Trạng thái</w:t>
+            </w:r>
+          </w:p>
+        </w:tc>
+      </w:tr>
+      <w:tr>
+        <w:trPr>
+          <w:cantSplit/>
+        </w:trPr>
+        <w:tc>
+          <w:tcPr>
+            <w:tcW w:type="dxa" w:w="1881"/>
+            <w:shd w:fill="FFFFFF"/>
+            <w:tcMar>
+              <w:top w:w="80" w:type="dxa"/>
+              <w:bottom w:w="80" w:type="dxa"/>
+              <w:left w:w="120" w:type="dxa"/>
+              <w:right w:w="120" w:type="dxa"/>
+            </w:tcMar>
+          </w:tcPr>
+          <w:p>
+            <w:pPr>
+              <w:spacing w:before="0" w:after="0" w:line="276" w:lineRule="auto"/>
+            </w:pPr>
+            <w:r>
+              <w:rPr>
+                <w:rFonts w:ascii="Arial" w:hAnsi="Arial"/>
+                <w:b/>
+                <w:color w:val="000000"/>
+                <w:sz w:val="18"/>
+              </w:rPr>
+              <w:t>1</w:t>
+            </w:r>
+          </w:p>
+        </w:tc>
+        <w:tc>
+          <w:tcPr>
+            <w:tcW w:type="dxa" w:w="1881"/>
+            <w:shd w:fill="FFFFFF"/>
+            <w:tcMar>
+              <w:top w:w="80" w:type="dxa"/>
+              <w:bottom w:w="80" w:type="dxa"/>
+              <w:left w:w="120" w:type="dxa"/>
+              <w:right w:w="120" w:type="dxa"/>
+            </w:tcMar>
+          </w:tcPr>
+          <w:p>
+            <w:pPr>
+              <w:spacing w:before="0" w:after="0" w:line="276" w:lineRule="auto"/>
+            </w:pPr>
+            <w:r>
+              <w:rPr>
+                <w:rFonts w:ascii="Arial" w:hAnsi="Arial"/>
+                <w:b/>
+                <w:color w:val="000000"/>
+                <w:sz w:val="18"/>
+              </w:rPr>
+              <w:t>Spark Driver JVM</w:t>
+              <w:br/>
+              <w:t>ERR-01-OOM</w:t>
+            </w:r>
+          </w:p>
+        </w:tc>
+        <w:tc>
+          <w:tcPr>
+            <w:tcW w:type="dxa" w:w="1881"/>
+            <w:shd w:fill="FFFFFF"/>
+            <w:tcMar>
+              <w:top w:w="80" w:type="dxa"/>
+              <w:bottom w:w="80" w:type="dxa"/>
+              <w:left w:w="120" w:type="dxa"/>
+              <w:right w:w="120" w:type="dxa"/>
+            </w:tcMar>
+          </w:tcPr>
+          <w:p>
+            <w:pPr>
+              <w:spacing w:before="0" w:after="0" w:line="276" w:lineRule="auto"/>
+            </w:pPr>
+            <w:r>
+              <w:rPr>
+                <w:rFonts w:ascii="Arial" w:hAnsi="Arial"/>
+                <w:color w:val="000000"/>
+                <w:sz w:val="18"/>
+              </w:rPr>
+              <w:t>java.lang.OutOfMemoryError khi thu thập 1.6M tweet. Bộ nhớ heap mặc định 1GB không đủ.</w:t>
+            </w:r>
+          </w:p>
+        </w:tc>
+        <w:tc>
+          <w:tcPr>
+            <w:tcW w:type="dxa" w:w="1881"/>
+            <w:shd w:fill="FFFFFF"/>
+            <w:tcMar>
+              <w:top w:w="80" w:type="dxa"/>
+              <w:bottom w:w="80" w:type="dxa"/>
+              <w:left w:w="120" w:type="dxa"/>
+              <w:right w:w="120" w:type="dxa"/>
+            </w:tcMar>
+          </w:tcPr>
+          <w:p>
+            <w:pPr>
+              <w:spacing w:before="0" w:after="0" w:line="276" w:lineRule="auto"/>
+            </w:pPr>
+            <w:r>
+              <w:rPr>
+                <w:rFonts w:ascii="Arial" w:hAnsi="Arial"/>
+                <w:color w:val="000000"/>
+                <w:sz w:val="18"/>
+              </w:rPr>
+              <w:t>Cấu hình spark.driver.memory=4g, spark.executor.memory=4g. Thay toàn bộ collect() sang xử lý phân tán.</w:t>
+            </w:r>
+          </w:p>
+        </w:tc>
+        <w:tc>
+          <w:tcPr>
+            <w:tcW w:type="dxa" w:w="1881"/>
+            <w:shd w:fill="FFFFFF"/>
+            <w:tcMar>
+              <w:top w:w="80" w:type="dxa"/>
+              <w:bottom w:w="80" w:type="dxa"/>
+              <w:left w:w="120" w:type="dxa"/>
+              <w:right w:w="120" w:type="dxa"/>
+            </w:tcMar>
+          </w:tcPr>
+          <w:p>
+            <w:pPr>
+              <w:spacing w:before="0" w:after="0" w:line="276" w:lineRule="auto"/>
+            </w:pPr>
+            <w:r>
+              <w:rPr>
+                <w:rFonts w:ascii="Arial" w:hAnsi="Arial"/>
+                <w:b/>
+                <w:color w:val="000000"/>
+                <w:sz w:val="18"/>
+              </w:rPr>
+              <w:t>ĐÃ XỬ LÝ (100%)</w:t>
+            </w:r>
+          </w:p>
+        </w:tc>
+      </w:tr>
+      <w:tr>
+        <w:trPr>
+          <w:cantSplit/>
+        </w:trPr>
+        <w:tc>
+          <w:tcPr>
+            <w:tcW w:type="dxa" w:w="1881"/>
+            <w:shd w:fill="FFFFFF"/>
+            <w:tcMar>
+              <w:top w:w="80" w:type="dxa"/>
+              <w:bottom w:w="80" w:type="dxa"/>
+              <w:left w:w="120" w:type="dxa"/>
+              <w:right w:w="120" w:type="dxa"/>
+            </w:tcMar>
+          </w:tcPr>
+          <w:p>
+            <w:pPr>
+              <w:spacing w:before="0" w:after="0" w:line="276" w:lineRule="auto"/>
+            </w:pPr>
+            <w:r>
+              <w:rPr>
+                <w:rFonts w:ascii="Arial" w:hAnsi="Arial"/>
+                <w:b/>
+                <w:color w:val="000000"/>
+                <w:sz w:val="18"/>
+              </w:rPr>
+              <w:t>2</w:t>
+            </w:r>
+          </w:p>
+        </w:tc>
+        <w:tc>
+          <w:tcPr>
+            <w:tcW w:type="dxa" w:w="1881"/>
+            <w:shd w:fill="FFFFFF"/>
+            <w:tcMar>
+              <w:top w:w="80" w:type="dxa"/>
+              <w:bottom w:w="80" w:type="dxa"/>
+              <w:left w:w="120" w:type="dxa"/>
+              <w:right w:w="120" w:type="dxa"/>
+            </w:tcMar>
+          </w:tcPr>
+          <w:p>
+            <w:pPr>
+              <w:spacing w:before="0" w:after="0" w:line="276" w:lineRule="auto"/>
+            </w:pPr>
+            <w:r>
+              <w:rPr>
+                <w:rFonts w:ascii="Arial" w:hAnsi="Arial"/>
+                <w:b/>
+                <w:color w:val="000000"/>
+                <w:sz w:val="18"/>
+              </w:rPr>
+              <w:t>CSV Ingestion</w:t>
+              <w:br/>
+              <w:t>ERR-02-ENCODING</w:t>
+            </w:r>
+          </w:p>
+        </w:tc>
+        <w:tc>
+          <w:tcPr>
+            <w:tcW w:type="dxa" w:w="1881"/>
+            <w:shd w:fill="FFFFFF"/>
+            <w:tcMar>
+              <w:top w:w="80" w:type="dxa"/>
+              <w:bottom w:w="80" w:type="dxa"/>
+              <w:left w:w="120" w:type="dxa"/>
+              <w:right w:w="120" w:type="dxa"/>
+            </w:tcMar>
+          </w:tcPr>
+          <w:p>
+            <w:pPr>
+              <w:spacing w:before="0" w:after="0" w:line="276" w:lineRule="auto"/>
+            </w:pPr>
+            <w:r>
+              <w:rPr>
+                <w:rFonts w:ascii="Arial" w:hAnsi="Arial"/>
+                <w:color w:val="000000"/>
+                <w:sz w:val="18"/>
+              </w:rPr>
+              <w:t>Lỗi font chữ, lệch cột do dataset Sentiment140 lưu theo Latin-1 ISO-8859-1 thay vì UTF-8.</w:t>
+            </w:r>
+          </w:p>
+        </w:tc>
+        <w:tc>
+          <w:tcPr>
+            <w:tcW w:type="dxa" w:w="1881"/>
+            <w:shd w:fill="FFFFFF"/>
+            <w:tcMar>
+              <w:top w:w="80" w:type="dxa"/>
+              <w:bottom w:w="80" w:type="dxa"/>
+              <w:left w:w="120" w:type="dxa"/>
+              <w:right w:w="120" w:type="dxa"/>
+            </w:tcMar>
+          </w:tcPr>
+          <w:p>
+            <w:pPr>
+              <w:spacing w:before="0" w:after="0" w:line="276" w:lineRule="auto"/>
+            </w:pPr>
+            <w:r>
+              <w:rPr>
+                <w:rFonts w:ascii="Arial" w:hAnsi="Arial"/>
+                <w:color w:val="000000"/>
+                <w:sz w:val="18"/>
+              </w:rPr>
+              <w:t>Khai báo option('encoding', 'ISO-8859-1'). Dùng clean_text_expr giải mã HTML entities và regex.</w:t>
+            </w:r>
+          </w:p>
+        </w:tc>
+        <w:tc>
+          <w:tcPr>
+            <w:tcW w:type="dxa" w:w="1881"/>
+            <w:shd w:fill="FFFFFF"/>
+            <w:tcMar>
+              <w:top w:w="80" w:type="dxa"/>
+              <w:bottom w:w="80" w:type="dxa"/>
+              <w:left w:w="120" w:type="dxa"/>
+              <w:right w:w="120" w:type="dxa"/>
+            </w:tcMar>
+          </w:tcPr>
+          <w:p>
+            <w:pPr>
+              <w:spacing w:before="0" w:after="0" w:line="276" w:lineRule="auto"/>
+            </w:pPr>
+            <w:r>
+              <w:rPr>
+                <w:rFonts w:ascii="Arial" w:hAnsi="Arial"/>
+                <w:b/>
+                <w:color w:val="000000"/>
+                <w:sz w:val="18"/>
+              </w:rPr>
+              <w:t>ĐÃ XỬ LÝ (100%)</w:t>
+            </w:r>
+          </w:p>
+        </w:tc>
+      </w:tr>
+      <w:tr>
+        <w:trPr>
+          <w:cantSplit/>
+        </w:trPr>
+        <w:tc>
+          <w:tcPr>
+            <w:tcW w:type="dxa" w:w="1881"/>
+            <w:shd w:fill="FFFFFF"/>
+            <w:tcMar>
+              <w:top w:w="80" w:type="dxa"/>
+              <w:bottom w:w="80" w:type="dxa"/>
+              <w:left w:w="120" w:type="dxa"/>
+              <w:right w:w="120" w:type="dxa"/>
+            </w:tcMar>
+          </w:tcPr>
+          <w:p>
+            <w:pPr>
+              <w:spacing w:before="0" w:after="0" w:line="276" w:lineRule="auto"/>
+            </w:pPr>
+            <w:r>
+              <w:rPr>
+                <w:rFonts w:ascii="Arial" w:hAnsi="Arial"/>
+                <w:b/>
+                <w:color w:val="000000"/>
+                <w:sz w:val="18"/>
+              </w:rPr>
+              <w:t>3</w:t>
+            </w:r>
+          </w:p>
+        </w:tc>
+        <w:tc>
+          <w:tcPr>
+            <w:tcW w:type="dxa" w:w="1881"/>
+            <w:shd w:fill="FFFFFF"/>
+            <w:tcMar>
+              <w:top w:w="80" w:type="dxa"/>
+              <w:bottom w:w="80" w:type="dxa"/>
+              <w:left w:w="120" w:type="dxa"/>
+              <w:right w:w="120" w:type="dxa"/>
+            </w:tcMar>
+          </w:tcPr>
+          <w:p>
+            <w:pPr>
+              <w:spacing w:before="0" w:after="0" w:line="276" w:lineRule="auto"/>
+            </w:pPr>
+            <w:r>
+              <w:rPr>
+                <w:rFonts w:ascii="Arial" w:hAnsi="Arial"/>
+                <w:b/>
+                <w:color w:val="000000"/>
+                <w:sz w:val="18"/>
+              </w:rPr>
+              <w:t>ML Pipeline</w:t>
+              <w:br/>
+              <w:t>ERR-03-LEAKAGE</w:t>
+            </w:r>
+          </w:p>
+        </w:tc>
+        <w:tc>
+          <w:tcPr>
+            <w:tcW w:type="dxa" w:w="1881"/>
+            <w:shd w:fill="FFFFFF"/>
+            <w:tcMar>
+              <w:top w:w="80" w:type="dxa"/>
+              <w:bottom w:w="80" w:type="dxa"/>
+              <w:left w:w="120" w:type="dxa"/>
+              <w:right w:w="120" w:type="dxa"/>
+            </w:tcMar>
+          </w:tcPr>
+          <w:p>
+            <w:pPr>
+              <w:spacing w:before="0" w:after="0" w:line="276" w:lineRule="auto"/>
+            </w:pPr>
+            <w:r>
+              <w:rPr>
+                <w:rFonts w:ascii="Arial" w:hAnsi="Arial"/>
+                <w:color w:val="000000"/>
+                <w:sz w:val="18"/>
+              </w:rPr>
+              <w:t>Rò rỉ thông tin tác giả giữa Train và Test khi chia ngẫu nhiên bằng randomSplit().</w:t>
+            </w:r>
+          </w:p>
+        </w:tc>
+        <w:tc>
+          <w:tcPr>
+            <w:tcW w:type="dxa" w:w="1881"/>
+            <w:shd w:fill="FFFFFF"/>
+            <w:tcMar>
+              <w:top w:w="80" w:type="dxa"/>
+              <w:bottom w:w="80" w:type="dxa"/>
+              <w:left w:w="120" w:type="dxa"/>
+              <w:right w:w="120" w:type="dxa"/>
+            </w:tcMar>
+          </w:tcPr>
+          <w:p>
+            <w:pPr>
+              <w:spacing w:before="0" w:after="0" w:line="276" w:lineRule="auto"/>
+            </w:pPr>
+            <w:r>
+              <w:rPr>
+                <w:rFonts w:ascii="Arial" w:hAnsi="Arial"/>
+                <w:color w:val="000000"/>
+                <w:sz w:val="18"/>
+              </w:rPr>
+              <w:t>Thuật toán băm xác định xxhash64(concat(id, date, user)) % 100 để chia 70/15/15, seed=42.</w:t>
+            </w:r>
+          </w:p>
+        </w:tc>
+        <w:tc>
+          <w:tcPr>
+            <w:tcW w:type="dxa" w:w="1881"/>
+            <w:shd w:fill="FFFFFF"/>
+            <w:tcMar>
+              <w:top w:w="80" w:type="dxa"/>
+              <w:bottom w:w="80" w:type="dxa"/>
+              <w:left w:w="120" w:type="dxa"/>
+              <w:right w:w="120" w:type="dxa"/>
+            </w:tcMar>
+          </w:tcPr>
+          <w:p>
+            <w:pPr>
+              <w:spacing w:before="0" w:after="0" w:line="276" w:lineRule="auto"/>
+            </w:pPr>
+            <w:r>
+              <w:rPr>
+                <w:rFonts w:ascii="Arial" w:hAnsi="Arial"/>
+                <w:b/>
+                <w:color w:val="000000"/>
+                <w:sz w:val="18"/>
+              </w:rPr>
+              <w:t>ĐÃ XỬ LÝ (100%)</w:t>
+            </w:r>
+          </w:p>
+        </w:tc>
+      </w:tr>
+      <w:tr>
+        <w:trPr>
+          <w:cantSplit/>
+        </w:trPr>
+        <w:tc>
+          <w:tcPr>
+            <w:tcW w:type="dxa" w:w="1881"/>
+            <w:shd w:fill="FFFFFF"/>
+            <w:tcMar>
+              <w:top w:w="80" w:type="dxa"/>
+              <w:bottom w:w="80" w:type="dxa"/>
+              <w:left w:w="120" w:type="dxa"/>
+              <w:right w:w="120" w:type="dxa"/>
+            </w:tcMar>
+          </w:tcPr>
+          <w:p>
+            <w:pPr>
+              <w:spacing w:before="0" w:after="0" w:line="276" w:lineRule="auto"/>
+            </w:pPr>
+            <w:r>
+              <w:rPr>
+                <w:rFonts w:ascii="Arial" w:hAnsi="Arial"/>
+                <w:b/>
+                <w:color w:val="000000"/>
+                <w:sz w:val="18"/>
+              </w:rPr>
+              <w:t>4</w:t>
+            </w:r>
+          </w:p>
+        </w:tc>
+        <w:tc>
+          <w:tcPr>
+            <w:tcW w:type="dxa" w:w="1881"/>
+            <w:shd w:fill="FFFFFF"/>
+            <w:tcMar>
+              <w:top w:w="80" w:type="dxa"/>
+              <w:bottom w:w="80" w:type="dxa"/>
+              <w:left w:w="120" w:type="dxa"/>
+              <w:right w:w="120" w:type="dxa"/>
+            </w:tcMar>
+          </w:tcPr>
+          <w:p>
+            <w:pPr>
+              <w:spacing w:before="0" w:after="0" w:line="276" w:lineRule="auto"/>
+            </w:pPr>
+            <w:r>
+              <w:rPr>
+                <w:rFonts w:ascii="Arial" w:hAnsi="Arial"/>
+                <w:b/>
+                <w:color w:val="000000"/>
+                <w:sz w:val="18"/>
+              </w:rPr>
+              <w:t>Windows Native</w:t>
+              <w:br/>
+              <w:t>ERR-04-WINUTILS</w:t>
+            </w:r>
+          </w:p>
+        </w:tc>
+        <w:tc>
+          <w:tcPr>
+            <w:tcW w:type="dxa" w:w="1881"/>
+            <w:shd w:fill="FFFFFF"/>
+            <w:tcMar>
+              <w:top w:w="80" w:type="dxa"/>
+              <w:bottom w:w="80" w:type="dxa"/>
+              <w:left w:w="120" w:type="dxa"/>
+              <w:right w:w="120" w:type="dxa"/>
+            </w:tcMar>
+          </w:tcPr>
+          <w:p>
+            <w:pPr>
+              <w:spacing w:before="0" w:after="0" w:line="276" w:lineRule="auto"/>
+            </w:pPr>
+            <w:r>
+              <w:rPr>
+                <w:rFonts w:ascii="Arial" w:hAnsi="Arial"/>
+                <w:color w:val="000000"/>
+                <w:sz w:val="18"/>
+              </w:rPr>
+              <w:t>Could not locate executable null\bin\winutils.exe khi ghi Parquet trên Windows NTFS.</w:t>
+            </w:r>
+          </w:p>
+        </w:tc>
+        <w:tc>
+          <w:tcPr>
+            <w:tcW w:type="dxa" w:w="1881"/>
+            <w:shd w:fill="FFFFFF"/>
+            <w:tcMar>
+              <w:top w:w="80" w:type="dxa"/>
+              <w:bottom w:w="80" w:type="dxa"/>
+              <w:left w:w="120" w:type="dxa"/>
+              <w:right w:w="120" w:type="dxa"/>
+            </w:tcMar>
+          </w:tcPr>
+          <w:p>
+            <w:pPr>
+              <w:spacing w:before="0" w:after="0" w:line="276" w:lineRule="auto"/>
+            </w:pPr>
+            <w:r>
+              <w:rPr>
+                <w:rFonts w:ascii="Arial" w:hAnsi="Arial"/>
+                <w:color w:val="000000"/>
+                <w:sz w:val="18"/>
+              </w:rPr>
+              <w:t>Tích hợp bộ nhị phân Hadoop 3.3.6 winutils vào .spark-support/winutils/bin/ và gán HADOOP_HOME.</w:t>
+            </w:r>
+          </w:p>
+        </w:tc>
+        <w:tc>
+          <w:tcPr>
+            <w:tcW w:type="dxa" w:w="1881"/>
+            <w:shd w:fill="FFFFFF"/>
+            <w:tcMar>
+              <w:top w:w="80" w:type="dxa"/>
+              <w:bottom w:w="80" w:type="dxa"/>
+              <w:left w:w="120" w:type="dxa"/>
+              <w:right w:w="120" w:type="dxa"/>
+            </w:tcMar>
+          </w:tcPr>
+          <w:p>
+            <w:pPr>
+              <w:spacing w:before="0" w:after="0" w:line="276" w:lineRule="auto"/>
+            </w:pPr>
+            <w:r>
+              <w:rPr>
+                <w:rFonts w:ascii="Arial" w:hAnsi="Arial"/>
+                <w:b/>
+                <w:color w:val="000000"/>
+                <w:sz w:val="18"/>
+              </w:rPr>
+              <w:t>ĐÃ XỬ LÝ (100%)</w:t>
+            </w:r>
+          </w:p>
+        </w:tc>
+      </w:tr>
+      <w:tr>
+        <w:trPr>
+          <w:cantSplit/>
+        </w:trPr>
+        <w:tc>
+          <w:tcPr>
+            <w:tcW w:type="dxa" w:w="1881"/>
+            <w:shd w:fill="FFFFFF"/>
+            <w:tcMar>
+              <w:top w:w="80" w:type="dxa"/>
+              <w:bottom w:w="80" w:type="dxa"/>
+              <w:left w:w="120" w:type="dxa"/>
+              <w:right w:w="120" w:type="dxa"/>
+            </w:tcMar>
+          </w:tcPr>
+          <w:p>
+            <w:pPr>
+              <w:spacing w:before="0" w:after="0" w:line="276" w:lineRule="auto"/>
+            </w:pPr>
+            <w:r>
+              <w:rPr>
+                <w:rFonts w:ascii="Arial" w:hAnsi="Arial"/>
+                <w:b/>
+                <w:color w:val="000000"/>
+                <w:sz w:val="18"/>
+              </w:rPr>
+              <w:t>5</w:t>
+            </w:r>
+          </w:p>
+        </w:tc>
+        <w:tc>
+          <w:tcPr>
+            <w:tcW w:type="dxa" w:w="1881"/>
+            <w:shd w:fill="FFFFFF"/>
+            <w:tcMar>
+              <w:top w:w="80" w:type="dxa"/>
+              <w:bottom w:w="80" w:type="dxa"/>
+              <w:left w:w="120" w:type="dxa"/>
+              <w:right w:w="120" w:type="dxa"/>
+            </w:tcMar>
+          </w:tcPr>
+          <w:p>
+            <w:pPr>
+              <w:spacing w:before="0" w:after="0" w:line="276" w:lineRule="auto"/>
+            </w:pPr>
+            <w:r>
+              <w:rPr>
+                <w:rFonts w:ascii="Arial" w:hAnsi="Arial"/>
+                <w:b/>
+                <w:color w:val="000000"/>
+                <w:sz w:val="18"/>
+              </w:rPr>
+              <w:t>Docker HDFS</w:t>
+              <w:br/>
+              <w:t>ERR-05-SAFEMODE</w:t>
+            </w:r>
+          </w:p>
+        </w:tc>
+        <w:tc>
+          <w:tcPr>
+            <w:tcW w:type="dxa" w:w="1881"/>
+            <w:shd w:fill="FFFFFF"/>
+            <w:tcMar>
+              <w:top w:w="80" w:type="dxa"/>
+              <w:bottom w:w="80" w:type="dxa"/>
+              <w:left w:w="120" w:type="dxa"/>
+              <w:right w:w="120" w:type="dxa"/>
+            </w:tcMar>
+          </w:tcPr>
+          <w:p>
+            <w:pPr>
+              <w:spacing w:before="0" w:after="0" w:line="276" w:lineRule="auto"/>
+            </w:pPr>
+            <w:r>
+              <w:rPr>
+                <w:rFonts w:ascii="Arial" w:hAnsi="Arial"/>
+                <w:color w:val="000000"/>
+                <w:sz w:val="18"/>
+              </w:rPr>
+              <w:t>NameNode is in safe mode khi nạp file hdfs dfs -put lúc vừa khởi động container.</w:t>
+            </w:r>
+          </w:p>
+        </w:tc>
+        <w:tc>
+          <w:tcPr>
+            <w:tcW w:type="dxa" w:w="1881"/>
+            <w:shd w:fill="FFFFFF"/>
+            <w:tcMar>
+              <w:top w:w="80" w:type="dxa"/>
+              <w:bottom w:w="80" w:type="dxa"/>
+              <w:left w:w="120" w:type="dxa"/>
+              <w:right w:w="120" w:type="dxa"/>
+            </w:tcMar>
+          </w:tcPr>
+          <w:p>
+            <w:pPr>
+              <w:spacing w:before="0" w:after="0" w:line="276" w:lineRule="auto"/>
+            </w:pPr>
+            <w:r>
+              <w:rPr>
+                <w:rFonts w:ascii="Arial" w:hAnsi="Arial"/>
+                <w:color w:val="000000"/>
+                <w:sz w:val="18"/>
+              </w:rPr>
+              <w:t>Logic kiểm tra hdfs dfsadmin -safemode get, tự động chạy safemode leave và retry 3 lần.</w:t>
+            </w:r>
+          </w:p>
+        </w:tc>
+        <w:tc>
+          <w:tcPr>
+            <w:tcW w:type="dxa" w:w="1881"/>
+            <w:shd w:fill="FFFFFF"/>
+            <w:tcMar>
+              <w:top w:w="80" w:type="dxa"/>
+              <w:bottom w:w="80" w:type="dxa"/>
+              <w:left w:w="120" w:type="dxa"/>
+              <w:right w:w="120" w:type="dxa"/>
+            </w:tcMar>
+          </w:tcPr>
+          <w:p>
+            <w:pPr>
+              <w:spacing w:before="0" w:after="0" w:line="276" w:lineRule="auto"/>
+            </w:pPr>
+            <w:r>
+              <w:rPr>
+                <w:rFonts w:ascii="Arial" w:hAnsi="Arial"/>
+                <w:b/>
+                <w:color w:val="000000"/>
+                <w:sz w:val="18"/>
+              </w:rPr>
+              <w:t>ĐÃ XỬ LÝ (100%)</w:t>
+            </w:r>
+          </w:p>
+        </w:tc>
+      </w:tr>
+      <w:tr>
+        <w:trPr>
+          <w:cantSplit/>
+        </w:trPr>
+        <w:tc>
+          <w:tcPr>
+            <w:tcW w:type="dxa" w:w="1881"/>
+            <w:shd w:fill="FFFFFF"/>
+            <w:tcMar>
+              <w:top w:w="80" w:type="dxa"/>
+              <w:bottom w:w="80" w:type="dxa"/>
+              <w:left w:w="120" w:type="dxa"/>
+              <w:right w:w="120" w:type="dxa"/>
+            </w:tcMar>
+          </w:tcPr>
+          <w:p>
+            <w:pPr>
+              <w:spacing w:before="0" w:after="0" w:line="276" w:lineRule="auto"/>
+            </w:pPr>
+            <w:r>
+              <w:rPr>
+                <w:rFonts w:ascii="Arial" w:hAnsi="Arial"/>
+                <w:b/>
+                <w:color w:val="000000"/>
+                <w:sz w:val="18"/>
+              </w:rPr>
+              <w:t>6</w:t>
+            </w:r>
+          </w:p>
+        </w:tc>
+        <w:tc>
+          <w:tcPr>
+            <w:tcW w:type="dxa" w:w="1881"/>
+            <w:shd w:fill="FFFFFF"/>
+            <w:tcMar>
+              <w:top w:w="80" w:type="dxa"/>
+              <w:bottom w:w="80" w:type="dxa"/>
+              <w:left w:w="120" w:type="dxa"/>
+              <w:right w:w="120" w:type="dxa"/>
+            </w:tcMar>
+          </w:tcPr>
+          <w:p>
+            <w:pPr>
+              <w:spacing w:before="0" w:after="0" w:line="276" w:lineRule="auto"/>
+            </w:pPr>
+            <w:r>
+              <w:rPr>
+                <w:rFonts w:ascii="Arial" w:hAnsi="Arial"/>
+                <w:b/>
+                <w:color w:val="000000"/>
+                <w:sz w:val="18"/>
+              </w:rPr>
+              <w:t>Airflow Engine</w:t>
+              <w:br/>
+              <w:t>ERR-06-AIRFLOW-PATH</w:t>
+            </w:r>
+          </w:p>
+        </w:tc>
+        <w:tc>
+          <w:tcPr>
+            <w:tcW w:type="dxa" w:w="1881"/>
+            <w:shd w:fill="FFFFFF"/>
+            <w:tcMar>
+              <w:top w:w="80" w:type="dxa"/>
+              <w:bottom w:w="80" w:type="dxa"/>
+              <w:left w:w="120" w:type="dxa"/>
+              <w:right w:w="120" w:type="dxa"/>
+            </w:tcMar>
+          </w:tcPr>
+          <w:p>
+            <w:pPr>
+              <w:spacing w:before="0" w:after="0" w:line="276" w:lineRule="auto"/>
+            </w:pPr>
+            <w:r>
+              <w:rPr>
+                <w:rFonts w:ascii="Arial" w:hAnsi="Arial"/>
+                <w:color w:val="000000"/>
+                <w:sz w:val="18"/>
+              </w:rPr>
+              <w:t>FileNotFoundError do không tương thích giữa đường dẫn Windows D:\ và Linux /opt/airflow.</w:t>
+            </w:r>
+          </w:p>
+        </w:tc>
+        <w:tc>
+          <w:tcPr>
+            <w:tcW w:type="dxa" w:w="1881"/>
+            <w:shd w:fill="FFFFFF"/>
+            <w:tcMar>
+              <w:top w:w="80" w:type="dxa"/>
+              <w:bottom w:w="80" w:type="dxa"/>
+              <w:left w:w="120" w:type="dxa"/>
+              <w:right w:w="120" w:type="dxa"/>
+            </w:tcMar>
+          </w:tcPr>
+          <w:p>
+            <w:pPr>
+              <w:spacing w:before="0" w:after="0" w:line="276" w:lineRule="auto"/>
+            </w:pPr>
+            <w:r>
+              <w:rPr>
+                <w:rFonts w:ascii="Arial" w:hAnsi="Arial"/>
+                <w:color w:val="000000"/>
+                <w:sz w:val="18"/>
+              </w:rPr>
+              <w:t>Chuẩn hóa đường dẫn tương đối bằng pathlib.Path độc lập nền tảng và thiết lập volume mount.</w:t>
+            </w:r>
+          </w:p>
+        </w:tc>
+        <w:tc>
+          <w:tcPr>
+            <w:tcW w:type="dxa" w:w="1881"/>
+            <w:shd w:fill="FFFFFF"/>
+            <w:tcMar>
+              <w:top w:w="80" w:type="dxa"/>
+              <w:bottom w:w="80" w:type="dxa"/>
+              <w:left w:w="120" w:type="dxa"/>
+              <w:right w:w="120" w:type="dxa"/>
+            </w:tcMar>
+          </w:tcPr>
+          <w:p>
+            <w:pPr>
+              <w:spacing w:before="0" w:after="0" w:line="276" w:lineRule="auto"/>
+            </w:pPr>
+            <w:r>
+              <w:rPr>
+                <w:rFonts w:ascii="Arial" w:hAnsi="Arial"/>
+                <w:b/>
+                <w:color w:val="000000"/>
+                <w:sz w:val="18"/>
+              </w:rPr>
+              <w:t>ĐÃ XỬ LÝ (100%)</w:t>
+            </w:r>
+          </w:p>
+        </w:tc>
+      </w:tr>
+      <w:tr>
+        <w:trPr>
+          <w:cantSplit/>
+        </w:trPr>
+        <w:tc>
+          <w:tcPr>
+            <w:tcW w:type="dxa" w:w="1881"/>
+            <w:shd w:fill="FFFFFF"/>
+            <w:tcMar>
+              <w:top w:w="80" w:type="dxa"/>
+              <w:bottom w:w="80" w:type="dxa"/>
+              <w:left w:w="120" w:type="dxa"/>
+              <w:right w:w="120" w:type="dxa"/>
+            </w:tcMar>
+          </w:tcPr>
+          <w:p>
+            <w:pPr>
+              <w:spacing w:before="0" w:after="0" w:line="276" w:lineRule="auto"/>
+            </w:pPr>
+            <w:r>
+              <w:rPr>
+                <w:rFonts w:ascii="Arial" w:hAnsi="Arial"/>
+                <w:b/>
+                <w:color w:val="000000"/>
+                <w:sz w:val="18"/>
+              </w:rPr>
+              <w:t>7</w:t>
+            </w:r>
+          </w:p>
+        </w:tc>
+        <w:tc>
+          <w:tcPr>
+            <w:tcW w:type="dxa" w:w="1881"/>
+            <w:shd w:fill="FFFFFF"/>
+            <w:tcMar>
+              <w:top w:w="80" w:type="dxa"/>
+              <w:bottom w:w="80" w:type="dxa"/>
+              <w:left w:w="120" w:type="dxa"/>
+              <w:right w:w="120" w:type="dxa"/>
+            </w:tcMar>
+          </w:tcPr>
+          <w:p>
+            <w:pPr>
+              <w:spacing w:before="0" w:after="0" w:line="276" w:lineRule="auto"/>
+            </w:pPr>
+            <w:r>
+              <w:rPr>
+                <w:rFonts w:ascii="Arial" w:hAnsi="Arial"/>
+                <w:b/>
+                <w:color w:val="000000"/>
+                <w:sz w:val="18"/>
+              </w:rPr>
+              <w:t>Desktop Tkinter</w:t>
+              <w:br/>
+              <w:t>ERR-07-GUI-FREEZE</w:t>
+            </w:r>
+          </w:p>
+        </w:tc>
+        <w:tc>
+          <w:tcPr>
+            <w:tcW w:type="dxa" w:w="1881"/>
+            <w:shd w:fill="FFFFFF"/>
+            <w:tcMar>
+              <w:top w:w="80" w:type="dxa"/>
+              <w:bottom w:w="80" w:type="dxa"/>
+              <w:left w:w="120" w:type="dxa"/>
+              <w:right w:w="120" w:type="dxa"/>
+            </w:tcMar>
+          </w:tcPr>
+          <w:p>
+            <w:pPr>
+              <w:spacing w:before="0" w:after="0" w:line="276" w:lineRule="auto"/>
+            </w:pPr>
+            <w:r>
+              <w:rPr>
+                <w:rFonts w:ascii="Arial" w:hAnsi="Arial"/>
+                <w:color w:val="000000"/>
+                <w:sz w:val="18"/>
+              </w:rPr>
+              <w:t>Cửa sổ Desktop GUI bị treo (Not Responding) khi chạy Spark job trên Main Thread.</w:t>
+            </w:r>
+          </w:p>
+        </w:tc>
+        <w:tc>
+          <w:tcPr>
+            <w:tcW w:type="dxa" w:w="1881"/>
+            <w:shd w:fill="FFFFFF"/>
+            <w:tcMar>
+              <w:top w:w="80" w:type="dxa"/>
+              <w:bottom w:w="80" w:type="dxa"/>
+              <w:left w:w="120" w:type="dxa"/>
+              <w:right w:w="120" w:type="dxa"/>
+            </w:tcMar>
+          </w:tcPr>
+          <w:p>
+            <w:pPr>
+              <w:spacing w:before="0" w:after="0" w:line="276" w:lineRule="auto"/>
+            </w:pPr>
+            <w:r>
+              <w:rPr>
+                <w:rFonts w:ascii="Arial" w:hAnsi="Arial"/>
+                <w:color w:val="000000"/>
+                <w:sz w:val="18"/>
+              </w:rPr>
+              <w:t>Tái cấu trúc đa luồng: Spark chạy trong threading.Thread(daemon=True), truyền log qua queue.Queue.</w:t>
+            </w:r>
+          </w:p>
+        </w:tc>
+        <w:tc>
+          <w:tcPr>
+            <w:tcW w:type="dxa" w:w="1881"/>
+            <w:shd w:fill="FFFFFF"/>
+            <w:tcMar>
+              <w:top w:w="80" w:type="dxa"/>
+              <w:bottom w:w="80" w:type="dxa"/>
+              <w:left w:w="120" w:type="dxa"/>
+              <w:right w:w="120" w:type="dxa"/>
+            </w:tcMar>
+          </w:tcPr>
+          <w:p>
+            <w:pPr>
+              <w:spacing w:before="0" w:after="0" w:line="276" w:lineRule="auto"/>
+            </w:pPr>
+            <w:r>
+              <w:rPr>
+                <w:rFonts w:ascii="Arial" w:hAnsi="Arial"/>
+                <w:b/>
+                <w:color w:val="000000"/>
+                <w:sz w:val="18"/>
+              </w:rPr>
+              <w:t>ĐÃ XỬ LÝ (100%)</w:t>
+            </w:r>
+          </w:p>
+        </w:tc>
+      </w:tr>
+    </w:tbl>
+    <w:p>
+      <w:pPr>
+        <w:spacing w:before="280" w:after="80"/>
+      </w:pPr>
+      <w:r>
+        <w:rPr>
+          <w:rFonts w:ascii="Arial" w:hAnsi="Arial"/>
+          <w:b/>
+          <w:sz w:val="24"/>
+        </w:rPr>
+        <w:t>LỊCH SỬ COMMIT GIT KIỂM CHỨNG QUÁ TRÌNH THỰC HIỆN LIÊN TỤC (8 COMMITS)</w:t>
+      </w:r>
+    </w:p>
+    <w:tbl>
+      <w:tblPr>
+        <w:tblW w:type="auto" w:w="0"/>
+        <w:jc w:val="center"/>
+        <w:tblLook w:firstColumn="1" w:firstRow="1" w:lastColumn="0" w:lastRow="0" w:noHBand="0" w:noVBand="1" w:val="04A0"/>
+        <w:tblBorders>
+          <w:top w:val="single" w:sz="4" w:space="0" w:color="000000"/>
+          <w:bottom w:val="single" w:sz="4" w:space="0" w:color="000000"/>
+          <w:left w:val="single" w:sz="4" w:space="0" w:color="000000"/>
+          <w:right w:val="single" w:sz="4" w:space="0" w:color="000000"/>
+          <w:insideH w:val="single" w:sz="4" w:space="0" w:color="000000"/>
+          <w:insideV w:val="single" w:sz="4" w:space="0" w:color="000000"/>
+        </w:tblBorders>
+      </w:tblPr>
+      <w:tblGrid>
+        <w:gridCol w:w="2351"/>
+        <w:gridCol w:w="2351"/>
+        <w:gridCol w:w="2351"/>
+        <w:gridCol w:w="2351"/>
+      </w:tblGrid>
+      <w:tr>
+        <w:trPr>
+          <w:tblHeader/>
+          <w:cantSplit/>
+        </w:trPr>
+        <w:tc>
+          <w:tcPr>
+            <w:tcW w:type="dxa" w:w="1440"/>
+            <w:shd w:fill="FFFFFF"/>
+            <w:tcMar>
+              <w:top w:w="120" w:type="dxa"/>
+              <w:bottom w:w="120" w:type="dxa"/>
+              <w:left w:w="140" w:type="dxa"/>
+              <w:right w:w="140" w:type="dxa"/>
+            </w:tcMar>
+          </w:tcPr>
+          <w:p>
+            <w:pPr>
+              <w:spacing w:before="0" w:after="0" w:line="276" w:lineRule="auto"/>
+              <w:jc w:val="center"/>
+            </w:pPr>
+            <w:r>
+              <w:rPr>
+                <w:rFonts w:ascii="Arial" w:hAnsi="Arial"/>
+                <w:b/>
+                <w:color w:val="000000"/>
+                <w:sz w:val="19"/>
+              </w:rPr>
+              <w:t>Commit Hash</w:t>
+            </w:r>
+          </w:p>
+        </w:tc>
+        <w:tc>
+          <w:tcPr>
+            <w:tcW w:type="dxa" w:w="1728"/>
+            <w:shd w:fill="FFFFFF"/>
+            <w:tcMar>
+              <w:top w:w="120" w:type="dxa"/>
+              <w:bottom w:w="120" w:type="dxa"/>
+              <w:left w:w="140" w:type="dxa"/>
+              <w:right w:w="140" w:type="dxa"/>
+            </w:tcMar>
+          </w:tcPr>
+          <w:p>
+            <w:pPr>
+              <w:spacing w:before="0" w:after="0" w:line="276" w:lineRule="auto"/>
+              <w:jc w:val="center"/>
+            </w:pPr>
+            <w:r>
+              <w:rPr>
+                <w:rFonts w:ascii="Arial" w:hAnsi="Arial"/>
+                <w:b/>
+                <w:color w:val="000000"/>
+                <w:sz w:val="19"/>
+              </w:rPr>
+              <w:t>Ngày thực hiện</w:t>
+            </w:r>
+          </w:p>
+        </w:tc>
+        <w:tc>
+          <w:tcPr>
+            <w:tcW w:type="dxa" w:w="1872"/>
+            <w:shd w:fill="FFFFFF"/>
+            <w:tcMar>
+              <w:top w:w="120" w:type="dxa"/>
+              <w:bottom w:w="120" w:type="dxa"/>
+              <w:left w:w="140" w:type="dxa"/>
+              <w:right w:w="140" w:type="dxa"/>
+            </w:tcMar>
+          </w:tcPr>
+          <w:p>
+            <w:pPr>
+              <w:spacing w:before="0" w:after="0" w:line="276" w:lineRule="auto"/>
+              <w:jc w:val="center"/>
+            </w:pPr>
+            <w:r>
+              <w:rPr>
+                <w:rFonts w:ascii="Arial" w:hAnsi="Arial"/>
+                <w:b/>
+                <w:color w:val="000000"/>
+                <w:sz w:val="19"/>
+              </w:rPr>
+              <w:t>Tác giả</w:t>
+            </w:r>
+          </w:p>
+        </w:tc>
+        <w:tc>
+          <w:tcPr>
+            <w:tcW w:type="dxa" w:w="4320"/>
+            <w:shd w:fill="FFFFFF"/>
+            <w:tcMar>
+              <w:top w:w="120" w:type="dxa"/>
+              <w:bottom w:w="120" w:type="dxa"/>
+              <w:left w:w="140" w:type="dxa"/>
+              <w:right w:w="140" w:type="dxa"/>
+            </w:tcMar>
+          </w:tcPr>
+          <w:p>
+            <w:pPr>
+              <w:spacing w:before="0" w:after="0" w:line="276" w:lineRule="auto"/>
+              <w:jc w:val="center"/>
+            </w:pPr>
+            <w:r>
+              <w:rPr>
+                <w:rFonts w:ascii="Arial" w:hAnsi="Arial"/>
+                <w:b/>
+                <w:color w:val="000000"/>
+                <w:sz w:val="19"/>
+              </w:rPr>
+              <w:t>Thông điệp commit (Nội dung)</w:t>
+            </w:r>
+          </w:p>
+        </w:tc>
+      </w:tr>
+      <w:tr>
+        <w:trPr>
+          <w:cantSplit/>
+        </w:trPr>
+        <w:tc>
+          <w:tcPr>
+            <w:tcW w:type="dxa" w:w="2351"/>
+            <w:shd w:fill="FFFFFF"/>
+            <w:tcMar>
+              <w:top w:w="80" w:type="dxa"/>
+              <w:bottom w:w="80" w:type="dxa"/>
+              <w:left w:w="120" w:type="dxa"/>
+              <w:right w:w="120" w:type="dxa"/>
+            </w:tcMar>
+          </w:tcPr>
+          <w:p>
+            <w:pPr>
+              <w:spacing w:before="0" w:after="0" w:line="276" w:lineRule="auto"/>
+            </w:pPr>
+            <w:r>
+              <w:rPr>
+                <w:rFonts w:ascii="Arial" w:hAnsi="Arial"/>
+                <w:b/>
+                <w:color w:val="000000"/>
+                <w:sz w:val="18"/>
+              </w:rPr>
+              <w:t>5d69a5a</w:t>
+            </w:r>
+          </w:p>
+        </w:tc>
+        <w:tc>
+          <w:tcPr>
+            <w:tcW w:type="dxa" w:w="2351"/>
+            <w:shd w:fill="FFFFFF"/>
+            <w:tcMar>
+              <w:top w:w="80" w:type="dxa"/>
+              <w:bottom w:w="80" w:type="dxa"/>
+              <w:left w:w="120" w:type="dxa"/>
+              <w:right w:w="120" w:type="dxa"/>
+            </w:tcMar>
+          </w:tcPr>
+          <w:p>
+            <w:pPr>
+              <w:spacing w:before="0" w:after="0" w:line="276" w:lineRule="auto"/>
+            </w:pPr>
+            <w:r>
+              <w:rPr>
+                <w:rFonts w:ascii="Arial" w:hAnsi="Arial"/>
+                <w:color w:val="000000"/>
+                <w:sz w:val="18"/>
+              </w:rPr>
+              <w:t>2026-08-05</w:t>
+            </w:r>
+          </w:p>
+        </w:tc>
+        <w:tc>
+          <w:tcPr>
+            <w:tcW w:type="dxa" w:w="2351"/>
+            <w:shd w:fill="FFFFFF"/>
+            <w:tcMar>
+              <w:top w:w="80" w:type="dxa"/>
+              <w:bottom w:w="80" w:type="dxa"/>
+              <w:left w:w="120" w:type="dxa"/>
+              <w:right w:w="120" w:type="dxa"/>
+            </w:tcMar>
+          </w:tcPr>
+          <w:p>
+            <w:pPr>
+              <w:spacing w:before="0" w:after="0" w:line="276" w:lineRule="auto"/>
+            </w:pPr>
+            <w:r>
+              <w:rPr>
+                <w:rFonts w:ascii="Arial" w:hAnsi="Arial"/>
+                <w:color w:val="000000"/>
+                <w:sz w:val="18"/>
+              </w:rPr>
+              <w:t>Võ Minh Cảnh</w:t>
+            </w:r>
+          </w:p>
+        </w:tc>
+        <w:tc>
+          <w:tcPr>
+            <w:tcW w:type="dxa" w:w="2351"/>
+            <w:shd w:fill="FFFFFF"/>
+            <w:tcMar>
+              <w:top w:w="80" w:type="dxa"/>
+              <w:bottom w:w="80" w:type="dxa"/>
+              <w:left w:w="120" w:type="dxa"/>
+              <w:right w:w="120" w:type="dxa"/>
+            </w:tcMar>
+          </w:tcPr>
+          <w:p>
+            <w:pPr>
+              <w:spacing w:before="0" w:after="0" w:line="276" w:lineRule="auto"/>
+            </w:pPr>
+            <w:r>
+              <w:rPr>
+                <w:rFonts w:ascii="Arial" w:hAnsi="Arial"/>
+                <w:color w:val="000000"/>
+                <w:sz w:val="18"/>
+              </w:rPr>
+              <w:t>feat: Khởi tạo repo, dataset Sentiment140 và Docker HDFS compose</w:t>
+            </w:r>
+          </w:p>
+        </w:tc>
+      </w:tr>
+      <w:tr>
+        <w:trPr>
+          <w:cantSplit/>
+        </w:trPr>
+        <w:tc>
+          <w:tcPr>
+            <w:tcW w:type="dxa" w:w="2351"/>
+            <w:shd w:fill="FFFFFF"/>
+            <w:tcMar>
+              <w:top w:w="80" w:type="dxa"/>
+              <w:bottom w:w="80" w:type="dxa"/>
+              <w:left w:w="120" w:type="dxa"/>
+              <w:right w:w="120" w:type="dxa"/>
+            </w:tcMar>
+          </w:tcPr>
+          <w:p>
+            <w:pPr>
+              <w:spacing w:before="0" w:after="0" w:line="276" w:lineRule="auto"/>
+            </w:pPr>
+            <w:r>
+              <w:rPr>
+                <w:rFonts w:ascii="Arial" w:hAnsi="Arial"/>
+                <w:b/>
+                <w:color w:val="000000"/>
+                <w:sz w:val="18"/>
+              </w:rPr>
+              <w:t>b482c19</w:t>
+            </w:r>
+          </w:p>
+        </w:tc>
+        <w:tc>
+          <w:tcPr>
+            <w:tcW w:type="dxa" w:w="2351"/>
+            <w:shd w:fill="FFFFFF"/>
+            <w:tcMar>
+              <w:top w:w="80" w:type="dxa"/>
+              <w:bottom w:w="80" w:type="dxa"/>
+              <w:left w:w="120" w:type="dxa"/>
+              <w:right w:w="120" w:type="dxa"/>
+            </w:tcMar>
+          </w:tcPr>
+          <w:p>
+            <w:pPr>
+              <w:spacing w:before="0" w:after="0" w:line="276" w:lineRule="auto"/>
+            </w:pPr>
+            <w:r>
+              <w:rPr>
+                <w:rFonts w:ascii="Arial" w:hAnsi="Arial"/>
+                <w:color w:val="000000"/>
+                <w:sz w:val="18"/>
+              </w:rPr>
+              <w:t>2026-08-14</w:t>
+            </w:r>
+          </w:p>
+        </w:tc>
+        <w:tc>
+          <w:tcPr>
+            <w:tcW w:type="dxa" w:w="2351"/>
+            <w:shd w:fill="FFFFFF"/>
+            <w:tcMar>
+              <w:top w:w="80" w:type="dxa"/>
+              <w:bottom w:w="80" w:type="dxa"/>
+              <w:left w:w="120" w:type="dxa"/>
+              <w:right w:w="120" w:type="dxa"/>
+            </w:tcMar>
+          </w:tcPr>
+          <w:p>
+            <w:pPr>
+              <w:spacing w:before="0" w:after="0" w:line="276" w:lineRule="auto"/>
+            </w:pPr>
+            <w:r>
+              <w:rPr>
+                <w:rFonts w:ascii="Arial" w:hAnsi="Arial"/>
+                <w:color w:val="000000"/>
+                <w:sz w:val="18"/>
+              </w:rPr>
+              <w:t>Hồ Thị Thanh Nhã</w:t>
+            </w:r>
+          </w:p>
+        </w:tc>
+        <w:tc>
+          <w:tcPr>
+            <w:tcW w:type="dxa" w:w="2351"/>
+            <w:shd w:fill="FFFFFF"/>
+            <w:tcMar>
+              <w:top w:w="80" w:type="dxa"/>
+              <w:bottom w:w="80" w:type="dxa"/>
+              <w:left w:w="120" w:type="dxa"/>
+              <w:right w:w="120" w:type="dxa"/>
+            </w:tcMar>
+          </w:tcPr>
+          <w:p>
+            <w:pPr>
+              <w:spacing w:before="0" w:after="0" w:line="276" w:lineRule="auto"/>
+            </w:pPr>
+            <w:r>
+              <w:rPr>
+                <w:rFonts w:ascii="Arial" w:hAnsi="Arial"/>
+                <w:color w:val="000000"/>
+                <w:sz w:val="18"/>
+              </w:rPr>
+              <w:t>feat: Script upload HDFS, kiểm tra cluster và format NameNode</w:t>
+            </w:r>
+          </w:p>
+        </w:tc>
+      </w:tr>
+      <w:tr>
+        <w:trPr>
+          <w:cantSplit/>
+        </w:trPr>
+        <w:tc>
+          <w:tcPr>
+            <w:tcW w:type="dxa" w:w="2351"/>
+            <w:shd w:fill="FFFFFF"/>
+            <w:tcMar>
+              <w:top w:w="80" w:type="dxa"/>
+              <w:bottom w:w="80" w:type="dxa"/>
+              <w:left w:w="120" w:type="dxa"/>
+              <w:right w:w="120" w:type="dxa"/>
+            </w:tcMar>
+          </w:tcPr>
+          <w:p>
+            <w:pPr>
+              <w:spacing w:before="0" w:after="0" w:line="276" w:lineRule="auto"/>
+            </w:pPr>
+            <w:r>
+              <w:rPr>
+                <w:rFonts w:ascii="Arial" w:hAnsi="Arial"/>
+                <w:b/>
+                <w:color w:val="000000"/>
+                <w:sz w:val="18"/>
+              </w:rPr>
+              <w:t>7c31d8e</w:t>
+            </w:r>
+          </w:p>
+        </w:tc>
+        <w:tc>
+          <w:tcPr>
+            <w:tcW w:type="dxa" w:w="2351"/>
+            <w:shd w:fill="FFFFFF"/>
+            <w:tcMar>
+              <w:top w:w="80" w:type="dxa"/>
+              <w:bottom w:w="80" w:type="dxa"/>
+              <w:left w:w="120" w:type="dxa"/>
+              <w:right w:w="120" w:type="dxa"/>
+            </w:tcMar>
+          </w:tcPr>
+          <w:p>
+            <w:pPr>
+              <w:spacing w:before="0" w:after="0" w:line="276" w:lineRule="auto"/>
+            </w:pPr>
+            <w:r>
+              <w:rPr>
+                <w:rFonts w:ascii="Arial" w:hAnsi="Arial"/>
+                <w:color w:val="000000"/>
+                <w:sz w:val="18"/>
+              </w:rPr>
+              <w:t>2026-08-22</w:t>
+            </w:r>
+          </w:p>
+        </w:tc>
+        <w:tc>
+          <w:tcPr>
+            <w:tcW w:type="dxa" w:w="2351"/>
+            <w:shd w:fill="FFFFFF"/>
+            <w:tcMar>
+              <w:top w:w="80" w:type="dxa"/>
+              <w:bottom w:w="80" w:type="dxa"/>
+              <w:left w:w="120" w:type="dxa"/>
+              <w:right w:w="120" w:type="dxa"/>
+            </w:tcMar>
+          </w:tcPr>
+          <w:p>
+            <w:pPr>
+              <w:spacing w:before="0" w:after="0" w:line="276" w:lineRule="auto"/>
+            </w:pPr>
+            <w:r>
+              <w:rPr>
+                <w:rFonts w:ascii="Arial" w:hAnsi="Arial"/>
+                <w:color w:val="000000"/>
+                <w:sz w:val="18"/>
+              </w:rPr>
+              <w:t>Võ Minh Cảnh</w:t>
+            </w:r>
+          </w:p>
+        </w:tc>
+        <w:tc>
+          <w:tcPr>
+            <w:tcW w:type="dxa" w:w="2351"/>
+            <w:shd w:fill="FFFFFF"/>
+            <w:tcMar>
+              <w:top w:w="80" w:type="dxa"/>
+              <w:bottom w:w="80" w:type="dxa"/>
+              <w:left w:w="120" w:type="dxa"/>
+              <w:right w:w="120" w:type="dxa"/>
+            </w:tcMar>
+          </w:tcPr>
+          <w:p>
+            <w:pPr>
+              <w:spacing w:before="0" w:after="0" w:line="276" w:lineRule="auto"/>
+            </w:pPr>
+            <w:r>
+              <w:rPr>
+                <w:rFonts w:ascii="Arial" w:hAnsi="Arial"/>
+                <w:color w:val="000000"/>
+                <w:sz w:val="18"/>
+              </w:rPr>
+              <w:t>feat: Module làm sạch văn bản, xử lý UTC và lưu Parquet Snappy</w:t>
+            </w:r>
+          </w:p>
+        </w:tc>
+      </w:tr>
+      <w:tr>
+        <w:trPr>
+          <w:cantSplit/>
+        </w:trPr>
+        <w:tc>
+          <w:tcPr>
+            <w:tcW w:type="dxa" w:w="2351"/>
+            <w:shd w:fill="FFFFFF"/>
+            <w:tcMar>
+              <w:top w:w="80" w:type="dxa"/>
+              <w:bottom w:w="80" w:type="dxa"/>
+              <w:left w:w="120" w:type="dxa"/>
+              <w:right w:w="120" w:type="dxa"/>
+            </w:tcMar>
+          </w:tcPr>
+          <w:p>
+            <w:pPr>
+              <w:spacing w:before="0" w:after="0" w:line="276" w:lineRule="auto"/>
+            </w:pPr>
+            <w:r>
+              <w:rPr>
+                <w:rFonts w:ascii="Arial" w:hAnsi="Arial"/>
+                <w:b/>
+                <w:color w:val="000000"/>
+                <w:sz w:val="18"/>
+              </w:rPr>
+              <w:t>9e45f21</w:t>
+            </w:r>
+          </w:p>
+        </w:tc>
+        <w:tc>
+          <w:tcPr>
+            <w:tcW w:type="dxa" w:w="2351"/>
+            <w:shd w:fill="FFFFFF"/>
+            <w:tcMar>
+              <w:top w:w="80" w:type="dxa"/>
+              <w:bottom w:w="80" w:type="dxa"/>
+              <w:left w:w="120" w:type="dxa"/>
+              <w:right w:w="120" w:type="dxa"/>
+            </w:tcMar>
+          </w:tcPr>
+          <w:p>
+            <w:pPr>
+              <w:spacing w:before="0" w:after="0" w:line="276" w:lineRule="auto"/>
+            </w:pPr>
+            <w:r>
+              <w:rPr>
+                <w:rFonts w:ascii="Arial" w:hAnsi="Arial"/>
+                <w:color w:val="000000"/>
+                <w:sz w:val="18"/>
+              </w:rPr>
+              <w:t>2026-08-28</w:t>
+            </w:r>
+          </w:p>
+        </w:tc>
+        <w:tc>
+          <w:tcPr>
+            <w:tcW w:type="dxa" w:w="2351"/>
+            <w:shd w:fill="FFFFFF"/>
+            <w:tcMar>
+              <w:top w:w="80" w:type="dxa"/>
+              <w:bottom w:w="80" w:type="dxa"/>
+              <w:left w:w="120" w:type="dxa"/>
+              <w:right w:w="120" w:type="dxa"/>
+            </w:tcMar>
+          </w:tcPr>
+          <w:p>
+            <w:pPr>
+              <w:spacing w:before="0" w:after="0" w:line="276" w:lineRule="auto"/>
+            </w:pPr>
+            <w:r>
+              <w:rPr>
+                <w:rFonts w:ascii="Arial" w:hAnsi="Arial"/>
+                <w:color w:val="000000"/>
+                <w:sz w:val="18"/>
+              </w:rPr>
+              <w:t>Hồ Thị Thanh Nhã</w:t>
+            </w:r>
+          </w:p>
+        </w:tc>
+        <w:tc>
+          <w:tcPr>
+            <w:tcW w:type="dxa" w:w="2351"/>
+            <w:shd w:fill="FFFFFF"/>
+            <w:tcMar>
+              <w:top w:w="80" w:type="dxa"/>
+              <w:bottom w:w="80" w:type="dxa"/>
+              <w:left w:w="120" w:type="dxa"/>
+              <w:right w:w="120" w:type="dxa"/>
+            </w:tcMar>
+          </w:tcPr>
+          <w:p>
+            <w:pPr>
+              <w:spacing w:before="0" w:after="0" w:line="276" w:lineRule="auto"/>
+            </w:pPr>
+            <w:r>
+              <w:rPr>
+                <w:rFonts w:ascii="Arial" w:hAnsi="Arial"/>
+                <w:color w:val="000000"/>
+                <w:sz w:val="18"/>
+              </w:rPr>
+              <w:t>feat: Spark SQL EDA (RQ1, RQ2, RQ3) và xuất 10 bảng CSV + biểu đồ</w:t>
+            </w:r>
+          </w:p>
+        </w:tc>
+      </w:tr>
+      <w:tr>
+        <w:trPr>
+          <w:cantSplit/>
+        </w:trPr>
+        <w:tc>
+          <w:tcPr>
+            <w:tcW w:type="dxa" w:w="2351"/>
+            <w:shd w:fill="FFFFFF"/>
+            <w:tcMar>
+              <w:top w:w="80" w:type="dxa"/>
+              <w:bottom w:w="80" w:type="dxa"/>
+              <w:left w:w="120" w:type="dxa"/>
+              <w:right w:w="120" w:type="dxa"/>
+            </w:tcMar>
+          </w:tcPr>
+          <w:p>
+            <w:pPr>
+              <w:spacing w:before="0" w:after="0" w:line="276" w:lineRule="auto"/>
+            </w:pPr>
+            <w:r>
+              <w:rPr>
+                <w:rFonts w:ascii="Arial" w:hAnsi="Arial"/>
+                <w:b/>
+                <w:color w:val="000000"/>
+                <w:sz w:val="18"/>
+              </w:rPr>
+              <w:t>2a18b74</w:t>
+            </w:r>
+          </w:p>
+        </w:tc>
+        <w:tc>
+          <w:tcPr>
+            <w:tcW w:type="dxa" w:w="2351"/>
+            <w:shd w:fill="FFFFFF"/>
+            <w:tcMar>
+              <w:top w:w="80" w:type="dxa"/>
+              <w:bottom w:w="80" w:type="dxa"/>
+              <w:left w:w="120" w:type="dxa"/>
+              <w:right w:w="120" w:type="dxa"/>
+            </w:tcMar>
+          </w:tcPr>
+          <w:p>
+            <w:pPr>
+              <w:spacing w:before="0" w:after="0" w:line="276" w:lineRule="auto"/>
+            </w:pPr>
+            <w:r>
+              <w:rPr>
+                <w:rFonts w:ascii="Arial" w:hAnsi="Arial"/>
+                <w:color w:val="000000"/>
+                <w:sz w:val="18"/>
+              </w:rPr>
+              <w:t>2026-09-08</w:t>
+            </w:r>
+          </w:p>
+        </w:tc>
+        <w:tc>
+          <w:tcPr>
+            <w:tcW w:type="dxa" w:w="2351"/>
+            <w:shd w:fill="FFFFFF"/>
+            <w:tcMar>
+              <w:top w:w="80" w:type="dxa"/>
+              <w:bottom w:w="80" w:type="dxa"/>
+              <w:left w:w="120" w:type="dxa"/>
+              <w:right w:w="120" w:type="dxa"/>
+            </w:tcMar>
+          </w:tcPr>
+          <w:p>
+            <w:pPr>
+              <w:spacing w:before="0" w:after="0" w:line="276" w:lineRule="auto"/>
+            </w:pPr>
+            <w:r>
+              <w:rPr>
+                <w:rFonts w:ascii="Arial" w:hAnsi="Arial"/>
+                <w:color w:val="000000"/>
+                <w:sz w:val="18"/>
+              </w:rPr>
+              <w:t>Võ Minh Cảnh</w:t>
+            </w:r>
+          </w:p>
+        </w:tc>
+        <w:tc>
+          <w:tcPr>
+            <w:tcW w:type="dxa" w:w="2351"/>
+            <w:shd w:fill="FFFFFF"/>
+            <w:tcMar>
+              <w:top w:w="80" w:type="dxa"/>
+              <w:bottom w:w="80" w:type="dxa"/>
+              <w:left w:w="120" w:type="dxa"/>
+              <w:right w:w="120" w:type="dxa"/>
+            </w:tcMar>
+          </w:tcPr>
+          <w:p>
+            <w:pPr>
+              <w:spacing w:before="0" w:after="0" w:line="276" w:lineRule="auto"/>
+            </w:pPr>
+            <w:r>
+              <w:rPr>
+                <w:rFonts w:ascii="Arial" w:hAnsi="Arial"/>
+                <w:color w:val="000000"/>
+                <w:sz w:val="18"/>
+              </w:rPr>
+              <w:t>feat: Spark MLlib TF-IDF + Logistic Regression, anti-leakage split</w:t>
+            </w:r>
+          </w:p>
+        </w:tc>
+      </w:tr>
+      <w:tr>
+        <w:trPr>
+          <w:cantSplit/>
+        </w:trPr>
+        <w:tc>
+          <w:tcPr>
+            <w:tcW w:type="dxa" w:w="2351"/>
+            <w:shd w:fill="FFFFFF"/>
+            <w:tcMar>
+              <w:top w:w="80" w:type="dxa"/>
+              <w:bottom w:w="80" w:type="dxa"/>
+              <w:left w:w="120" w:type="dxa"/>
+              <w:right w:w="120" w:type="dxa"/>
+            </w:tcMar>
+          </w:tcPr>
+          <w:p>
+            <w:pPr>
+              <w:spacing w:before="0" w:after="0" w:line="276" w:lineRule="auto"/>
+            </w:pPr>
+            <w:r>
+              <w:rPr>
+                <w:rFonts w:ascii="Arial" w:hAnsi="Arial"/>
+                <w:b/>
+                <w:color w:val="000000"/>
+                <w:sz w:val="18"/>
+              </w:rPr>
+              <w:t>f603c98</w:t>
+            </w:r>
+          </w:p>
+        </w:tc>
+        <w:tc>
+          <w:tcPr>
+            <w:tcW w:type="dxa" w:w="2351"/>
+            <w:shd w:fill="FFFFFF"/>
+            <w:tcMar>
+              <w:top w:w="80" w:type="dxa"/>
+              <w:bottom w:w="80" w:type="dxa"/>
+              <w:left w:w="120" w:type="dxa"/>
+              <w:right w:w="120" w:type="dxa"/>
+            </w:tcMar>
+          </w:tcPr>
+          <w:p>
+            <w:pPr>
+              <w:spacing w:before="0" w:after="0" w:line="276" w:lineRule="auto"/>
+            </w:pPr>
+            <w:r>
+              <w:rPr>
+                <w:rFonts w:ascii="Arial" w:hAnsi="Arial"/>
+                <w:color w:val="000000"/>
+                <w:sz w:val="18"/>
+              </w:rPr>
+              <w:t>2026-09-15</w:t>
+            </w:r>
+          </w:p>
+        </w:tc>
+        <w:tc>
+          <w:tcPr>
+            <w:tcW w:type="dxa" w:w="2351"/>
+            <w:shd w:fill="FFFFFF"/>
+            <w:tcMar>
+              <w:top w:w="80" w:type="dxa"/>
+              <w:bottom w:w="80" w:type="dxa"/>
+              <w:left w:w="120" w:type="dxa"/>
+              <w:right w:w="120" w:type="dxa"/>
+            </w:tcMar>
+          </w:tcPr>
+          <w:p>
+            <w:pPr>
+              <w:spacing w:before="0" w:after="0" w:line="276" w:lineRule="auto"/>
+            </w:pPr>
+            <w:r>
+              <w:rPr>
+                <w:rFonts w:ascii="Arial" w:hAnsi="Arial"/>
+                <w:color w:val="000000"/>
+                <w:sz w:val="18"/>
+              </w:rPr>
+              <w:t>Hồ Thị Thanh Nhã</w:t>
+            </w:r>
+          </w:p>
+        </w:tc>
+        <w:tc>
+          <w:tcPr>
+            <w:tcW w:type="dxa" w:w="2351"/>
+            <w:shd w:fill="FFFFFF"/>
+            <w:tcMar>
+              <w:top w:w="80" w:type="dxa"/>
+              <w:bottom w:w="80" w:type="dxa"/>
+              <w:left w:w="120" w:type="dxa"/>
+              <w:right w:w="120" w:type="dxa"/>
+            </w:tcMar>
+          </w:tcPr>
+          <w:p>
+            <w:pPr>
+              <w:spacing w:before="0" w:after="0" w:line="276" w:lineRule="auto"/>
+            </w:pPr>
+            <w:r>
+              <w:rPr>
+                <w:rFonts w:ascii="Arial" w:hAnsi="Arial"/>
+                <w:color w:val="000000"/>
+                <w:sz w:val="18"/>
+              </w:rPr>
+              <w:t>feat: Mô hình Naive Bayes, benchmark Spark Cache và storage metrics</w:t>
+            </w:r>
+          </w:p>
+        </w:tc>
+      </w:tr>
+      <w:tr>
+        <w:trPr>
+          <w:cantSplit/>
+        </w:trPr>
+        <w:tc>
+          <w:tcPr>
+            <w:tcW w:type="dxa" w:w="2351"/>
+            <w:shd w:fill="FFFFFF"/>
+            <w:tcMar>
+              <w:top w:w="80" w:type="dxa"/>
+              <w:bottom w:w="80" w:type="dxa"/>
+              <w:left w:w="120" w:type="dxa"/>
+              <w:right w:w="120" w:type="dxa"/>
+            </w:tcMar>
+          </w:tcPr>
+          <w:p>
+            <w:pPr>
+              <w:spacing w:before="0" w:after="0" w:line="276" w:lineRule="auto"/>
+            </w:pPr>
+            <w:r>
+              <w:rPr>
+                <w:rFonts w:ascii="Arial" w:hAnsi="Arial"/>
+                <w:b/>
+                <w:color w:val="000000"/>
+                <w:sz w:val="18"/>
+              </w:rPr>
+              <w:t>3d72e41</w:t>
+            </w:r>
+          </w:p>
+        </w:tc>
+        <w:tc>
+          <w:tcPr>
+            <w:tcW w:type="dxa" w:w="2351"/>
+            <w:shd w:fill="FFFFFF"/>
+            <w:tcMar>
+              <w:top w:w="80" w:type="dxa"/>
+              <w:bottom w:w="80" w:type="dxa"/>
+              <w:left w:w="120" w:type="dxa"/>
+              <w:right w:w="120" w:type="dxa"/>
+            </w:tcMar>
+          </w:tcPr>
+          <w:p>
+            <w:pPr>
+              <w:spacing w:before="0" w:after="0" w:line="276" w:lineRule="auto"/>
+            </w:pPr>
+            <w:r>
+              <w:rPr>
+                <w:rFonts w:ascii="Arial" w:hAnsi="Arial"/>
+                <w:color w:val="000000"/>
+                <w:sz w:val="18"/>
+              </w:rPr>
+              <w:t>2026-09-24</w:t>
+            </w:r>
+          </w:p>
+        </w:tc>
+        <w:tc>
+          <w:tcPr>
+            <w:tcW w:type="dxa" w:w="2351"/>
+            <w:shd w:fill="FFFFFF"/>
+            <w:tcMar>
+              <w:top w:w="80" w:type="dxa"/>
+              <w:bottom w:w="80" w:type="dxa"/>
+              <w:left w:w="120" w:type="dxa"/>
+              <w:right w:w="120" w:type="dxa"/>
+            </w:tcMar>
+          </w:tcPr>
+          <w:p>
+            <w:pPr>
+              <w:spacing w:before="0" w:after="0" w:line="276" w:lineRule="auto"/>
+            </w:pPr>
+            <w:r>
+              <w:rPr>
+                <w:rFonts w:ascii="Arial" w:hAnsi="Arial"/>
+                <w:color w:val="000000"/>
+                <w:sz w:val="18"/>
+              </w:rPr>
+              <w:t>Võ Minh Cảnh</w:t>
+            </w:r>
+          </w:p>
+        </w:tc>
+        <w:tc>
+          <w:tcPr>
+            <w:tcW w:type="dxa" w:w="2351"/>
+            <w:shd w:fill="FFFFFF"/>
+            <w:tcMar>
+              <w:top w:w="80" w:type="dxa"/>
+              <w:bottom w:w="80" w:type="dxa"/>
+              <w:left w:w="120" w:type="dxa"/>
+              <w:right w:w="120" w:type="dxa"/>
+            </w:tcMar>
+          </w:tcPr>
+          <w:p>
+            <w:pPr>
+              <w:spacing w:before="0" w:after="0" w:line="276" w:lineRule="auto"/>
+            </w:pPr>
+            <w:r>
+              <w:rPr>
+                <w:rFonts w:ascii="Arial" w:hAnsi="Arial"/>
+                <w:color w:val="000000"/>
+                <w:sz w:val="18"/>
+              </w:rPr>
+              <w:t>feat: Airflow DAG 9 tasks, Desktop GUI Tkinter và Interactive Prediction</w:t>
+            </w:r>
+          </w:p>
+        </w:tc>
+      </w:tr>
+      <w:tr>
+        <w:trPr>
+          <w:cantSplit/>
+        </w:trPr>
+        <w:tc>
+          <w:tcPr>
+            <w:tcW w:type="dxa" w:w="2351"/>
+            <w:shd w:fill="FFFFFF"/>
+            <w:tcMar>
+              <w:top w:w="80" w:type="dxa"/>
+              <w:bottom w:w="80" w:type="dxa"/>
+              <w:left w:w="120" w:type="dxa"/>
+              <w:right w:w="120" w:type="dxa"/>
+            </w:tcMar>
+          </w:tcPr>
+          <w:p>
+            <w:pPr>
+              <w:spacing w:before="0" w:after="0" w:line="276" w:lineRule="auto"/>
+            </w:pPr>
+            <w:r>
+              <w:rPr>
+                <w:rFonts w:ascii="Arial" w:hAnsi="Arial"/>
+                <w:b/>
+                <w:color w:val="000000"/>
+                <w:sz w:val="18"/>
+              </w:rPr>
+              <w:t>d5feb86</w:t>
+            </w:r>
+          </w:p>
+        </w:tc>
+        <w:tc>
+          <w:tcPr>
+            <w:tcW w:type="dxa" w:w="2351"/>
+            <w:shd w:fill="FFFFFF"/>
+            <w:tcMar>
+              <w:top w:w="80" w:type="dxa"/>
+              <w:bottom w:w="80" w:type="dxa"/>
+              <w:left w:w="120" w:type="dxa"/>
+              <w:right w:w="120" w:type="dxa"/>
+            </w:tcMar>
+          </w:tcPr>
+          <w:p>
+            <w:pPr>
+              <w:spacing w:before="0" w:after="0" w:line="276" w:lineRule="auto"/>
+            </w:pPr>
+            <w:r>
+              <w:rPr>
+                <w:rFonts w:ascii="Arial" w:hAnsi="Arial"/>
+                <w:color w:val="000000"/>
+                <w:sz w:val="18"/>
+              </w:rPr>
+              <w:t>2026-10-18</w:t>
+            </w:r>
+          </w:p>
+        </w:tc>
+        <w:tc>
+          <w:tcPr>
+            <w:tcW w:type="dxa" w:w="2351"/>
+            <w:shd w:fill="FFFFFF"/>
+            <w:tcMar>
+              <w:top w:w="80" w:type="dxa"/>
+              <w:bottom w:w="80" w:type="dxa"/>
+              <w:left w:w="120" w:type="dxa"/>
+              <w:right w:w="120" w:type="dxa"/>
+            </w:tcMar>
+          </w:tcPr>
+          <w:p>
+            <w:pPr>
+              <w:spacing w:before="0" w:after="0" w:line="276" w:lineRule="auto"/>
+            </w:pPr>
+            <w:r>
+              <w:rPr>
+                <w:rFonts w:ascii="Arial" w:hAnsi="Arial"/>
+                <w:color w:val="000000"/>
+                <w:sz w:val="18"/>
+              </w:rPr>
+              <w:t>Võ Minh Cảnh</w:t>
+            </w:r>
+          </w:p>
+        </w:tc>
+        <w:tc>
+          <w:tcPr>
+            <w:tcW w:type="dxa" w:w="2351"/>
+            <w:shd w:fill="FFFFFF"/>
+            <w:tcMar>
+              <w:top w:w="80" w:type="dxa"/>
+              <w:bottom w:w="80" w:type="dxa"/>
+              <w:left w:w="120" w:type="dxa"/>
+              <w:right w:w="120" w:type="dxa"/>
+            </w:tcMar>
+          </w:tcPr>
+          <w:p>
+            <w:pPr>
+              <w:spacing w:before="0" w:after="0" w:line="276" w:lineRule="auto"/>
+            </w:pPr>
+            <w:r>
+              <w:rPr>
+                <w:rFonts w:ascii="Arial" w:hAnsi="Arial"/>
+                <w:color w:val="000000"/>
+                <w:sz w:val="18"/>
+              </w:rPr>
+              <w:t>docs: Hoàn thiện video demo MP4, bảng lỗi và hồ sơ nghiệm thu cuối kỳ</w:t>
+            </w:r>
+          </w:p>
+        </w:tc>
+      </w:tr>
+    </w:tbl>
+    <w:p>
+      <w:pPr>
+        <w:spacing w:before="280" w:after="80"/>
+      </w:pPr>
+      <w:r>
+        <w:rPr>
+          <w:rFonts w:ascii="Arial" w:hAnsi="Arial"/>
+          <w:b/>
+          <w:sz w:val="24"/>
+        </w:rPr>
+        <w:t>DANH MỤC MINH CHỨNG VÀ HƯỚNG DẪN KIỂM CHỨNG VIDEO DEMO</w:t>
+      </w:r>
+    </w:p>
+    <w:p>
+      <w:r>
+        <w:t>Nhóm sinh viên bàn giao trọn bộ gói nghiệm thu hoàn chỉnh bao gồm:</w:t>
+        <w:br/>
+        <w:t>1. Video Demo Giao diện &amp; Pipeline: video_demo/video_demo_gui_pipeline.mp4 (45 giây, HD 1280x720, 20 FPS quay chi tiết vận hành Desktop GUI, nạp HDFS, chạy Spark pipeline và suy luận cảm xúc trực tiếp).</w:t>
+        <w:br/>
+        <w:t>2. Toàn bộ 8 tệp log thực tế trong thư mục logs/ (hdfs_upload.log, spark_execution.log, airflow_dag_run.log, bang_loi_va_su_co.log, v.v.).</w:t>
+        <w:br/>
+        <w:t>3. Toàn bộ 14 hình ảnh gốc trong thư mục figures/ (Sơ đồ kiến trúc Hình 3.1, Airflow UI Hình 3.2, HDFS UI Hình 3.3, GUI Dashboard Hình 4.1, Spark UI Hình 4.2, GUI Predict Hình 4.3, Ma trận nhầm lẫn Hình 5.6).</w:t>
+        <w:br/>
+        <w:t>4. Toàn bộ 10 bảng CSV kết quả trong thư mục tables/ và 7 biểu đồ trong charts/.</w:t>
+        <w:br/>
+        <w:t>5. Toàn bộ mã nguồn chạy được trong source_code/ và tệp nén ZIP hoàn chỉnh Nhom09_BaoCaoCuoiKy_BigData_HoSoNghiemThu.zip.</w:t>
+      </w:r>
+    </w:p>
+    <w:p>
+      <w:pPr>
+        <w:pageBreakBefore/>
+        <w:spacing w:before="280" w:after="80"/>
+      </w:pPr>
+      <w:r>
+        <w:rPr>
+          <w:rFonts w:ascii="Arial" w:hAnsi="Arial"/>
+          <w:b/>
+          <w:color w:val="000000"/>
+          <w:sz w:val="26"/>
+        </w:rPr>
+        <w:t>BẢNG THEO DÕI VÀ XỬ LÝ LỖI KỸ THUẬT (BUG &amp; TROUBLESHOOTING LOG)</w:t>
+      </w:r>
+    </w:p>
+    <w:p>
+      <w:r>
+        <w:t>Trong suốt quá trình triển khai hệ thống phân tích Big Data trên 1.6 triệu dòng dữ liệu Sentiment140, nhóm đã ghi nhận, phân tích nguyên nhân và xử lý triệt để 7 sự cố kỹ thuật trọng tâm:</w:t>
+      </w:r>
+    </w:p>
+    <w:tbl>
+      <w:tblPr>
+        <w:tblW w:type="auto" w:w="0"/>
+        <w:jc w:val="center"/>
+        <w:tblLook w:firstColumn="1" w:firstRow="1" w:lastColumn="0" w:lastRow="0" w:noHBand="0" w:noVBand="1" w:val="04A0"/>
+        <w:tblBorders>
+          <w:top w:val="single" w:sz="4" w:space="0" w:color="000000"/>
+          <w:bottom w:val="single" w:sz="4" w:space="0" w:color="000000"/>
+          <w:left w:val="single" w:sz="4" w:space="0" w:color="000000"/>
+          <w:right w:val="single" w:sz="4" w:space="0" w:color="000000"/>
+          <w:insideH w:val="single" w:sz="4" w:space="0" w:color="000000"/>
+          <w:insideV w:val="single" w:sz="4" w:space="0" w:color="000000"/>
+        </w:tblBorders>
+      </w:tblPr>
+      <w:tblGrid>
+        <w:gridCol w:w="1881"/>
+        <w:gridCol w:w="1881"/>
+        <w:gridCol w:w="1881"/>
+        <w:gridCol w:w="1881"/>
+        <w:gridCol w:w="1881"/>
+      </w:tblGrid>
+      <w:tr>
+        <w:trPr>
+          <w:tblHeader/>
+          <w:cantSplit/>
+        </w:trPr>
+        <w:tc>
+          <w:tcPr>
+            <w:tcW w:type="dxa" w:w="720"/>
+            <w:shd w:fill="FFFFFF"/>
+            <w:tcMar>
+              <w:top w:w="120" w:type="dxa"/>
+              <w:bottom w:w="120" w:type="dxa"/>
+              <w:left w:w="140" w:type="dxa"/>
+              <w:right w:w="140" w:type="dxa"/>
+            </w:tcMar>
+          </w:tcPr>
+          <w:p>
+            <w:pPr>
+              <w:spacing w:before="0" w:after="0" w:line="276" w:lineRule="auto"/>
+              <w:jc w:val="center"/>
+            </w:pPr>
+            <w:r>
+              <w:rPr>
+                <w:rFonts w:ascii="Arial" w:hAnsi="Arial"/>
+                <w:b/>
+                <w:color w:val="000000"/>
+                <w:sz w:val="19"/>
+              </w:rPr>
+              <w:t>STT</w:t>
+            </w:r>
+          </w:p>
+        </w:tc>
+        <w:tc>
+          <w:tcPr>
+            <w:tcW w:type="dxa" w:w="2160"/>
+            <w:shd w:fill="FFFFFF"/>
+            <w:tcMar>
+              <w:top w:w="120" w:type="dxa"/>
+              <w:bottom w:w="120" w:type="dxa"/>
+              <w:left w:w="140" w:type="dxa"/>
+              <w:right w:w="140" w:type="dxa"/>
+            </w:tcMar>
+          </w:tcPr>
+          <w:p>
+            <w:pPr>
+              <w:spacing w:before="0" w:after="0" w:line="276" w:lineRule="auto"/>
+              <w:jc w:val="center"/>
+            </w:pPr>
+            <w:r>
+              <w:rPr>
+                <w:rFonts w:ascii="Arial" w:hAnsi="Arial"/>
+                <w:b/>
+                <w:color w:val="000000"/>
+                <w:sz w:val="19"/>
+              </w:rPr>
+              <w:t>Hệ thống / Mã lỗi</w:t>
+            </w:r>
+          </w:p>
+        </w:tc>
+        <w:tc>
+          <w:tcPr>
+            <w:tcW w:type="dxa" w:w="2304"/>
+            <w:shd w:fill="FFFFFF"/>
+            <w:tcMar>
+              <w:top w:w="120" w:type="dxa"/>
+              <w:bottom w:w="120" w:type="dxa"/>
+              <w:left w:w="140" w:type="dxa"/>
+              <w:right w:w="140" w:type="dxa"/>
+            </w:tcMar>
+          </w:tcPr>
+          <w:p>
+            <w:pPr>
+              <w:spacing w:before="0" w:after="0" w:line="276" w:lineRule="auto"/>
+              <w:jc w:val="center"/>
+            </w:pPr>
+            <w:r>
+              <w:rPr>
+                <w:rFonts w:ascii="Arial" w:hAnsi="Arial"/>
+                <w:b/>
+                <w:color w:val="000000"/>
+                <w:sz w:val="19"/>
+              </w:rPr>
+              <w:t>Triệu chứng &amp; Nguyên nhân</w:t>
+            </w:r>
+          </w:p>
+        </w:tc>
+        <w:tc>
+          <w:tcPr>
+            <w:tcW w:type="dxa" w:w="2736"/>
+            <w:shd w:fill="FFFFFF"/>
+            <w:tcMar>
+              <w:top w:w="120" w:type="dxa"/>
+              <w:bottom w:w="120" w:type="dxa"/>
+              <w:left w:w="140" w:type="dxa"/>
+              <w:right w:w="140" w:type="dxa"/>
+            </w:tcMar>
+          </w:tcPr>
+          <w:p>
+            <w:pPr>
+              <w:spacing w:before="0" w:after="0" w:line="276" w:lineRule="auto"/>
+              <w:jc w:val="center"/>
+            </w:pPr>
+            <w:r>
+              <w:rPr>
+                <w:rFonts w:ascii="Arial" w:hAnsi="Arial"/>
+                <w:b/>
+                <w:color w:val="000000"/>
+                <w:sz w:val="19"/>
+              </w:rPr>
+              <w:t>Giải pháp kỹ thuật khắc phục</w:t>
+            </w:r>
+          </w:p>
+        </w:tc>
+        <w:tc>
+          <w:tcPr>
+            <w:tcW w:type="dxa" w:w="1440"/>
+            <w:shd w:fill="FFFFFF"/>
+            <w:tcMar>
+              <w:top w:w="120" w:type="dxa"/>
+              <w:bottom w:w="120" w:type="dxa"/>
+              <w:left w:w="140" w:type="dxa"/>
+              <w:right w:w="140" w:type="dxa"/>
+            </w:tcMar>
+          </w:tcPr>
+          <w:p>
+            <w:pPr>
+              <w:spacing w:before="0" w:after="0" w:line="276" w:lineRule="auto"/>
+              <w:jc w:val="center"/>
+            </w:pPr>
+            <w:r>
+              <w:rPr>
+                <w:rFonts w:ascii="Arial" w:hAnsi="Arial"/>
+                <w:b/>
+                <w:color w:val="000000"/>
+                <w:sz w:val="19"/>
+              </w:rPr>
+              <w:t>Trạng thái</w:t>
+            </w:r>
+          </w:p>
+        </w:tc>
+      </w:tr>
+      <w:tr>
+        <w:trPr>
+          <w:cantSplit/>
+        </w:trPr>
+        <w:tc>
+          <w:tcPr>
+            <w:tcW w:type="dxa" w:w="1881"/>
+            <w:shd w:fill="FFFFFF"/>
+            <w:tcMar>
+              <w:top w:w="80" w:type="dxa"/>
+              <w:bottom w:w="80" w:type="dxa"/>
+              <w:left w:w="120" w:type="dxa"/>
+              <w:right w:w="120" w:type="dxa"/>
+            </w:tcMar>
+          </w:tcPr>
+          <w:p>
+            <w:pPr>
+              <w:spacing w:before="0" w:after="0" w:line="276" w:lineRule="auto"/>
+            </w:pPr>
+            <w:r>
+              <w:rPr>
+                <w:rFonts w:ascii="Arial" w:hAnsi="Arial"/>
+                <w:b/>
+                <w:color w:val="000000"/>
+                <w:sz w:val="18"/>
+              </w:rPr>
+              <w:t>1</w:t>
+            </w:r>
+          </w:p>
+        </w:tc>
+        <w:tc>
+          <w:tcPr>
+            <w:tcW w:type="dxa" w:w="1881"/>
+            <w:shd w:fill="FFFFFF"/>
+            <w:tcMar>
+              <w:top w:w="80" w:type="dxa"/>
+              <w:bottom w:w="80" w:type="dxa"/>
+              <w:left w:w="120" w:type="dxa"/>
+              <w:right w:w="120" w:type="dxa"/>
+            </w:tcMar>
+          </w:tcPr>
+          <w:p>
+            <w:pPr>
+              <w:spacing w:before="0" w:after="0" w:line="276" w:lineRule="auto"/>
+            </w:pPr>
+            <w:r>
+              <w:rPr>
+                <w:rFonts w:ascii="Arial" w:hAnsi="Arial"/>
+                <w:b/>
+                <w:color w:val="000000"/>
+                <w:sz w:val="18"/>
+              </w:rPr>
+              <w:t>Spark Driver JVM</w:t>
+              <w:br/>
+              <w:t>ERR-01-OOM</w:t>
+            </w:r>
+          </w:p>
+        </w:tc>
+        <w:tc>
+          <w:tcPr>
+            <w:tcW w:type="dxa" w:w="1881"/>
+            <w:shd w:fill="FFFFFF"/>
+            <w:tcMar>
+              <w:top w:w="80" w:type="dxa"/>
+              <w:bottom w:w="80" w:type="dxa"/>
+              <w:left w:w="120" w:type="dxa"/>
+              <w:right w:w="120" w:type="dxa"/>
+            </w:tcMar>
+          </w:tcPr>
+          <w:p>
+            <w:pPr>
+              <w:spacing w:before="0" w:after="0" w:line="276" w:lineRule="auto"/>
+            </w:pPr>
+            <w:r>
+              <w:rPr>
+                <w:rFonts w:ascii="Arial" w:hAnsi="Arial"/>
+                <w:color w:val="000000"/>
+                <w:sz w:val="18"/>
+              </w:rPr>
+              <w:t>java.lang.OutOfMemoryError khi thu thập 1.6M tweet. Bộ nhớ heap mặc định 1GB không đủ.</w:t>
+            </w:r>
+          </w:p>
+        </w:tc>
+        <w:tc>
+          <w:tcPr>
+            <w:tcW w:type="dxa" w:w="1881"/>
+            <w:shd w:fill="FFFFFF"/>
+            <w:tcMar>
+              <w:top w:w="80" w:type="dxa"/>
+              <w:bottom w:w="80" w:type="dxa"/>
+              <w:left w:w="120" w:type="dxa"/>
+              <w:right w:w="120" w:type="dxa"/>
+            </w:tcMar>
+          </w:tcPr>
+          <w:p>
+            <w:pPr>
+              <w:spacing w:before="0" w:after="0" w:line="276" w:lineRule="auto"/>
+            </w:pPr>
+            <w:r>
+              <w:rPr>
+                <w:rFonts w:ascii="Arial" w:hAnsi="Arial"/>
+                <w:color w:val="000000"/>
+                <w:sz w:val="18"/>
+              </w:rPr>
+              <w:t>Cấu hình spark.driver.memory=4g, spark.executor.memory=4g. Thay toàn bộ collect() sang xử lý phân tán.</w:t>
+            </w:r>
+          </w:p>
+        </w:tc>
+        <w:tc>
+          <w:tcPr>
+            <w:tcW w:type="dxa" w:w="1881"/>
+            <w:shd w:fill="FFFFFF"/>
+            <w:tcMar>
+              <w:top w:w="80" w:type="dxa"/>
+              <w:bottom w:w="80" w:type="dxa"/>
+              <w:left w:w="120" w:type="dxa"/>
+              <w:right w:w="120" w:type="dxa"/>
+            </w:tcMar>
+          </w:tcPr>
+          <w:p>
+            <w:pPr>
+              <w:spacing w:before="0" w:after="0" w:line="276" w:lineRule="auto"/>
+            </w:pPr>
+            <w:r>
+              <w:rPr>
+                <w:rFonts w:ascii="Arial" w:hAnsi="Arial"/>
+                <w:b/>
+                <w:color w:val="000000"/>
+                <w:sz w:val="18"/>
+              </w:rPr>
+              <w:t>ĐÃ XỬ LÝ (100%)</w:t>
+            </w:r>
+          </w:p>
+        </w:tc>
+      </w:tr>
+      <w:tr>
+        <w:trPr>
+          <w:cantSplit/>
+        </w:trPr>
+        <w:tc>
+          <w:tcPr>
+            <w:tcW w:type="dxa" w:w="1881"/>
+            <w:shd w:fill="FFFFFF"/>
+            <w:tcMar>
+              <w:top w:w="80" w:type="dxa"/>
+              <w:bottom w:w="80" w:type="dxa"/>
+              <w:left w:w="120" w:type="dxa"/>
+              <w:right w:w="120" w:type="dxa"/>
+            </w:tcMar>
+          </w:tcPr>
+          <w:p>
+            <w:pPr>
+              <w:spacing w:before="0" w:after="0" w:line="276" w:lineRule="auto"/>
+            </w:pPr>
+            <w:r>
+              <w:rPr>
+                <w:rFonts w:ascii="Arial" w:hAnsi="Arial"/>
+                <w:b/>
+                <w:color w:val="000000"/>
+                <w:sz w:val="18"/>
+              </w:rPr>
+              <w:t>2</w:t>
+            </w:r>
+          </w:p>
+        </w:tc>
+        <w:tc>
+          <w:tcPr>
+            <w:tcW w:type="dxa" w:w="1881"/>
+            <w:shd w:fill="FFFFFF"/>
+            <w:tcMar>
+              <w:top w:w="80" w:type="dxa"/>
+              <w:bottom w:w="80" w:type="dxa"/>
+              <w:left w:w="120" w:type="dxa"/>
+              <w:right w:w="120" w:type="dxa"/>
+            </w:tcMar>
+          </w:tcPr>
+          <w:p>
+            <w:pPr>
+              <w:spacing w:before="0" w:after="0" w:line="276" w:lineRule="auto"/>
+            </w:pPr>
+            <w:r>
+              <w:rPr>
+                <w:rFonts w:ascii="Arial" w:hAnsi="Arial"/>
+                <w:b/>
+                <w:color w:val="000000"/>
+                <w:sz w:val="18"/>
+              </w:rPr>
+              <w:t>CSV Ingestion</w:t>
+              <w:br/>
+              <w:t>ERR-02-ENCODING</w:t>
+            </w:r>
+          </w:p>
+        </w:tc>
+        <w:tc>
+          <w:tcPr>
+            <w:tcW w:type="dxa" w:w="1881"/>
+            <w:shd w:fill="FFFFFF"/>
+            <w:tcMar>
+              <w:top w:w="80" w:type="dxa"/>
+              <w:bottom w:w="80" w:type="dxa"/>
+              <w:left w:w="120" w:type="dxa"/>
+              <w:right w:w="120" w:type="dxa"/>
+            </w:tcMar>
+          </w:tcPr>
+          <w:p>
+            <w:pPr>
+              <w:spacing w:before="0" w:after="0" w:line="276" w:lineRule="auto"/>
+            </w:pPr>
+            <w:r>
+              <w:rPr>
+                <w:rFonts w:ascii="Arial" w:hAnsi="Arial"/>
+                <w:color w:val="000000"/>
+                <w:sz w:val="18"/>
+              </w:rPr>
+              <w:t>Lỗi font chữ, lệch cột do dataset Sentiment140 lưu theo Latin-1 ISO-8859-1 thay vì UTF-8.</w:t>
+            </w:r>
+          </w:p>
+        </w:tc>
+        <w:tc>
+          <w:tcPr>
+            <w:tcW w:type="dxa" w:w="1881"/>
+            <w:shd w:fill="FFFFFF"/>
+            <w:tcMar>
+              <w:top w:w="80" w:type="dxa"/>
+              <w:bottom w:w="80" w:type="dxa"/>
+              <w:left w:w="120" w:type="dxa"/>
+              <w:right w:w="120" w:type="dxa"/>
+            </w:tcMar>
+          </w:tcPr>
+          <w:p>
+            <w:pPr>
+              <w:spacing w:before="0" w:after="0" w:line="276" w:lineRule="auto"/>
+            </w:pPr>
+            <w:r>
+              <w:rPr>
+                <w:rFonts w:ascii="Arial" w:hAnsi="Arial"/>
+                <w:color w:val="000000"/>
+                <w:sz w:val="18"/>
+              </w:rPr>
+              <w:t>Khai báo option('encoding', 'ISO-8859-1'). Dùng clean_text_expr giải mã HTML entities và regex.</w:t>
+            </w:r>
+          </w:p>
+        </w:tc>
+        <w:tc>
+          <w:tcPr>
+            <w:tcW w:type="dxa" w:w="1881"/>
+            <w:shd w:fill="FFFFFF"/>
+            <w:tcMar>
+              <w:top w:w="80" w:type="dxa"/>
+              <w:bottom w:w="80" w:type="dxa"/>
+              <w:left w:w="120" w:type="dxa"/>
+              <w:right w:w="120" w:type="dxa"/>
+            </w:tcMar>
+          </w:tcPr>
+          <w:p>
+            <w:pPr>
+              <w:spacing w:before="0" w:after="0" w:line="276" w:lineRule="auto"/>
+            </w:pPr>
+            <w:r>
+              <w:rPr>
+                <w:rFonts w:ascii="Arial" w:hAnsi="Arial"/>
+                <w:b/>
+                <w:color w:val="000000"/>
+                <w:sz w:val="18"/>
+              </w:rPr>
+              <w:t>ĐÃ XỬ LÝ (100%)</w:t>
+            </w:r>
+          </w:p>
+        </w:tc>
+      </w:tr>
+      <w:tr>
+        <w:trPr>
+          <w:cantSplit/>
+        </w:trPr>
+        <w:tc>
+          <w:tcPr>
+            <w:tcW w:type="dxa" w:w="1881"/>
+            <w:shd w:fill="FFFFFF"/>
+            <w:tcMar>
+              <w:top w:w="80" w:type="dxa"/>
+              <w:bottom w:w="80" w:type="dxa"/>
+              <w:left w:w="120" w:type="dxa"/>
+              <w:right w:w="120" w:type="dxa"/>
+            </w:tcMar>
+          </w:tcPr>
+          <w:p>
+            <w:pPr>
+              <w:spacing w:before="0" w:after="0" w:line="276" w:lineRule="auto"/>
+            </w:pPr>
+            <w:r>
+              <w:rPr>
+                <w:rFonts w:ascii="Arial" w:hAnsi="Arial"/>
+                <w:b/>
+                <w:color w:val="000000"/>
+                <w:sz w:val="18"/>
+              </w:rPr>
+              <w:t>3</w:t>
+            </w:r>
+          </w:p>
+        </w:tc>
+        <w:tc>
+          <w:tcPr>
+            <w:tcW w:type="dxa" w:w="1881"/>
+            <w:shd w:fill="FFFFFF"/>
+            <w:tcMar>
+              <w:top w:w="80" w:type="dxa"/>
+              <w:bottom w:w="80" w:type="dxa"/>
+              <w:left w:w="120" w:type="dxa"/>
+              <w:right w:w="120" w:type="dxa"/>
+            </w:tcMar>
+          </w:tcPr>
+          <w:p>
+            <w:pPr>
+              <w:spacing w:before="0" w:after="0" w:line="276" w:lineRule="auto"/>
+            </w:pPr>
+            <w:r>
+              <w:rPr>
+                <w:rFonts w:ascii="Arial" w:hAnsi="Arial"/>
+                <w:b/>
+                <w:color w:val="000000"/>
+                <w:sz w:val="18"/>
+              </w:rPr>
+              <w:t>ML Pipeline</w:t>
+              <w:br/>
+              <w:t>ERR-03-LEAKAGE</w:t>
+            </w:r>
+          </w:p>
+        </w:tc>
+        <w:tc>
+          <w:tcPr>
+            <w:tcW w:type="dxa" w:w="1881"/>
+            <w:shd w:fill="FFFFFF"/>
+            <w:tcMar>
+              <w:top w:w="80" w:type="dxa"/>
+              <w:bottom w:w="80" w:type="dxa"/>
+              <w:left w:w="120" w:type="dxa"/>
+              <w:right w:w="120" w:type="dxa"/>
+            </w:tcMar>
+          </w:tcPr>
+          <w:p>
+            <w:pPr>
+              <w:spacing w:before="0" w:after="0" w:line="276" w:lineRule="auto"/>
+            </w:pPr>
+            <w:r>
+              <w:rPr>
+                <w:rFonts w:ascii="Arial" w:hAnsi="Arial"/>
+                <w:color w:val="000000"/>
+                <w:sz w:val="18"/>
+              </w:rPr>
+              <w:t>Rò rỉ thông tin tác giả giữa Train và Test khi chia ngẫu nhiên bằng randomSplit().</w:t>
+            </w:r>
+          </w:p>
+        </w:tc>
+        <w:tc>
+          <w:tcPr>
+            <w:tcW w:type="dxa" w:w="1881"/>
+            <w:shd w:fill="FFFFFF"/>
+            <w:tcMar>
+              <w:top w:w="80" w:type="dxa"/>
+              <w:bottom w:w="80" w:type="dxa"/>
+              <w:left w:w="120" w:type="dxa"/>
+              <w:right w:w="120" w:type="dxa"/>
+            </w:tcMar>
+          </w:tcPr>
+          <w:p>
+            <w:pPr>
+              <w:spacing w:before="0" w:after="0" w:line="276" w:lineRule="auto"/>
+            </w:pPr>
+            <w:r>
+              <w:rPr>
+                <w:rFonts w:ascii="Arial" w:hAnsi="Arial"/>
+                <w:color w:val="000000"/>
+                <w:sz w:val="18"/>
+              </w:rPr>
+              <w:t>Thuật toán băm xác định xxhash64(concat(id, date, user)) % 100 để chia 70/15/15, seed=42.</w:t>
+            </w:r>
+          </w:p>
+        </w:tc>
+        <w:tc>
+          <w:tcPr>
+            <w:tcW w:type="dxa" w:w="1881"/>
+            <w:shd w:fill="FFFFFF"/>
+            <w:tcMar>
+              <w:top w:w="80" w:type="dxa"/>
+              <w:bottom w:w="80" w:type="dxa"/>
+              <w:left w:w="120" w:type="dxa"/>
+              <w:right w:w="120" w:type="dxa"/>
+            </w:tcMar>
+          </w:tcPr>
+          <w:p>
+            <w:pPr>
+              <w:spacing w:before="0" w:after="0" w:line="276" w:lineRule="auto"/>
+            </w:pPr>
+            <w:r>
+              <w:rPr>
+                <w:rFonts w:ascii="Arial" w:hAnsi="Arial"/>
+                <w:b/>
+                <w:color w:val="000000"/>
+                <w:sz w:val="18"/>
+              </w:rPr>
+              <w:t>ĐÃ XỬ LÝ (100%)</w:t>
+            </w:r>
+          </w:p>
+        </w:tc>
+      </w:tr>
+      <w:tr>
+        <w:trPr>
+          <w:cantSplit/>
+        </w:trPr>
+        <w:tc>
+          <w:tcPr>
+            <w:tcW w:type="dxa" w:w="1881"/>
+            <w:shd w:fill="FFFFFF"/>
+            <w:tcMar>
+              <w:top w:w="80" w:type="dxa"/>
+              <w:bottom w:w="80" w:type="dxa"/>
+              <w:left w:w="120" w:type="dxa"/>
+              <w:right w:w="120" w:type="dxa"/>
+            </w:tcMar>
+          </w:tcPr>
+          <w:p>
+            <w:pPr>
+              <w:spacing w:before="0" w:after="0" w:line="276" w:lineRule="auto"/>
+            </w:pPr>
+            <w:r>
+              <w:rPr>
+                <w:rFonts w:ascii="Arial" w:hAnsi="Arial"/>
+                <w:b/>
+                <w:color w:val="000000"/>
+                <w:sz w:val="18"/>
+              </w:rPr>
+              <w:t>4</w:t>
+            </w:r>
+          </w:p>
+        </w:tc>
+        <w:tc>
+          <w:tcPr>
+            <w:tcW w:type="dxa" w:w="1881"/>
+            <w:shd w:fill="FFFFFF"/>
+            <w:tcMar>
+              <w:top w:w="80" w:type="dxa"/>
+              <w:bottom w:w="80" w:type="dxa"/>
+              <w:left w:w="120" w:type="dxa"/>
+              <w:right w:w="120" w:type="dxa"/>
+            </w:tcMar>
+          </w:tcPr>
+          <w:p>
+            <w:pPr>
+              <w:spacing w:before="0" w:after="0" w:line="276" w:lineRule="auto"/>
+            </w:pPr>
+            <w:r>
+              <w:rPr>
+                <w:rFonts w:ascii="Arial" w:hAnsi="Arial"/>
+                <w:b/>
+                <w:color w:val="000000"/>
+                <w:sz w:val="18"/>
+              </w:rPr>
+              <w:t>Windows Native</w:t>
+              <w:br/>
+              <w:t>ERR-04-WINUTILS</w:t>
+            </w:r>
+          </w:p>
+        </w:tc>
+        <w:tc>
+          <w:tcPr>
+            <w:tcW w:type="dxa" w:w="1881"/>
+            <w:shd w:fill="FFFFFF"/>
+            <w:tcMar>
+              <w:top w:w="80" w:type="dxa"/>
+              <w:bottom w:w="80" w:type="dxa"/>
+              <w:left w:w="120" w:type="dxa"/>
+              <w:right w:w="120" w:type="dxa"/>
+            </w:tcMar>
+          </w:tcPr>
+          <w:p>
+            <w:pPr>
+              <w:spacing w:before="0" w:after="0" w:line="276" w:lineRule="auto"/>
+            </w:pPr>
+            <w:r>
+              <w:rPr>
+                <w:rFonts w:ascii="Arial" w:hAnsi="Arial"/>
+                <w:color w:val="000000"/>
+                <w:sz w:val="18"/>
+              </w:rPr>
+              <w:t>Could not locate executable null\bin\winutils.exe khi ghi Parquet trên Windows NTFS.</w:t>
+            </w:r>
+          </w:p>
+        </w:tc>
+        <w:tc>
+          <w:tcPr>
+            <w:tcW w:type="dxa" w:w="1881"/>
+            <w:shd w:fill="FFFFFF"/>
+            <w:tcMar>
+              <w:top w:w="80" w:type="dxa"/>
+              <w:bottom w:w="80" w:type="dxa"/>
+              <w:left w:w="120" w:type="dxa"/>
+              <w:right w:w="120" w:type="dxa"/>
+            </w:tcMar>
+          </w:tcPr>
+          <w:p>
+            <w:pPr>
+              <w:spacing w:before="0" w:after="0" w:line="276" w:lineRule="auto"/>
+            </w:pPr>
+            <w:r>
+              <w:rPr>
+                <w:rFonts w:ascii="Arial" w:hAnsi="Arial"/>
+                <w:color w:val="000000"/>
+                <w:sz w:val="18"/>
+              </w:rPr>
+              <w:t>Tích hợp bộ nhị phân Hadoop 3.3.6 winutils vào .spark-support/winutils/bin/ và gán HADOOP_HOME.</w:t>
+            </w:r>
+          </w:p>
+        </w:tc>
+        <w:tc>
+          <w:tcPr>
+            <w:tcW w:type="dxa" w:w="1881"/>
+            <w:shd w:fill="FFFFFF"/>
+            <w:tcMar>
+              <w:top w:w="80" w:type="dxa"/>
+              <w:bottom w:w="80" w:type="dxa"/>
+              <w:left w:w="120" w:type="dxa"/>
+              <w:right w:w="120" w:type="dxa"/>
+            </w:tcMar>
+          </w:tcPr>
+          <w:p>
+            <w:pPr>
+              <w:spacing w:before="0" w:after="0" w:line="276" w:lineRule="auto"/>
+            </w:pPr>
+            <w:r>
+              <w:rPr>
+                <w:rFonts w:ascii="Arial" w:hAnsi="Arial"/>
+                <w:b/>
+                <w:color w:val="000000"/>
+                <w:sz w:val="18"/>
+              </w:rPr>
+              <w:t>ĐÃ XỬ LÝ (100%)</w:t>
+            </w:r>
+          </w:p>
+        </w:tc>
+      </w:tr>
+      <w:tr>
+        <w:trPr>
+          <w:cantSplit/>
+        </w:trPr>
+        <w:tc>
+          <w:tcPr>
+            <w:tcW w:type="dxa" w:w="1881"/>
+            <w:shd w:fill="FFFFFF"/>
+            <w:tcMar>
+              <w:top w:w="80" w:type="dxa"/>
+              <w:bottom w:w="80" w:type="dxa"/>
+              <w:left w:w="120" w:type="dxa"/>
+              <w:right w:w="120" w:type="dxa"/>
+            </w:tcMar>
+          </w:tcPr>
+          <w:p>
+            <w:pPr>
+              <w:spacing w:before="0" w:after="0" w:line="276" w:lineRule="auto"/>
+            </w:pPr>
+            <w:r>
+              <w:rPr>
+                <w:rFonts w:ascii="Arial" w:hAnsi="Arial"/>
+                <w:b/>
+                <w:color w:val="000000"/>
+                <w:sz w:val="18"/>
+              </w:rPr>
+              <w:t>5</w:t>
+            </w:r>
+          </w:p>
+        </w:tc>
+        <w:tc>
+          <w:tcPr>
+            <w:tcW w:type="dxa" w:w="1881"/>
+            <w:shd w:fill="FFFFFF"/>
+            <w:tcMar>
+              <w:top w:w="80" w:type="dxa"/>
+              <w:bottom w:w="80" w:type="dxa"/>
+              <w:left w:w="120" w:type="dxa"/>
+              <w:right w:w="120" w:type="dxa"/>
+            </w:tcMar>
+          </w:tcPr>
+          <w:p>
+            <w:pPr>
+              <w:spacing w:before="0" w:after="0" w:line="276" w:lineRule="auto"/>
+            </w:pPr>
+            <w:r>
+              <w:rPr>
+                <w:rFonts w:ascii="Arial" w:hAnsi="Arial"/>
+                <w:b/>
+                <w:color w:val="000000"/>
+                <w:sz w:val="18"/>
+              </w:rPr>
+              <w:t>Docker HDFS</w:t>
+              <w:br/>
+              <w:t>ERR-05-SAFEMODE</w:t>
+            </w:r>
+          </w:p>
+        </w:tc>
+        <w:tc>
+          <w:tcPr>
+            <w:tcW w:type="dxa" w:w="1881"/>
+            <w:shd w:fill="FFFFFF"/>
+            <w:tcMar>
+              <w:top w:w="80" w:type="dxa"/>
+              <w:bottom w:w="80" w:type="dxa"/>
+              <w:left w:w="120" w:type="dxa"/>
+              <w:right w:w="120" w:type="dxa"/>
+            </w:tcMar>
+          </w:tcPr>
+          <w:p>
+            <w:pPr>
+              <w:spacing w:before="0" w:after="0" w:line="276" w:lineRule="auto"/>
+            </w:pPr>
+            <w:r>
+              <w:rPr>
+                <w:rFonts w:ascii="Arial" w:hAnsi="Arial"/>
+                <w:color w:val="000000"/>
+                <w:sz w:val="18"/>
+              </w:rPr>
+              <w:t>NameNode is in safe mode khi nạp file hdfs dfs -put lúc vừa khởi động container.</w:t>
+            </w:r>
+          </w:p>
+        </w:tc>
+        <w:tc>
+          <w:tcPr>
+            <w:tcW w:type="dxa" w:w="1881"/>
+            <w:shd w:fill="FFFFFF"/>
+            <w:tcMar>
+              <w:top w:w="80" w:type="dxa"/>
+              <w:bottom w:w="80" w:type="dxa"/>
+              <w:left w:w="120" w:type="dxa"/>
+              <w:right w:w="120" w:type="dxa"/>
+            </w:tcMar>
+          </w:tcPr>
+          <w:p>
+            <w:pPr>
+              <w:spacing w:before="0" w:after="0" w:line="276" w:lineRule="auto"/>
+            </w:pPr>
+            <w:r>
+              <w:rPr>
+                <w:rFonts w:ascii="Arial" w:hAnsi="Arial"/>
+                <w:color w:val="000000"/>
+                <w:sz w:val="18"/>
+              </w:rPr>
+              <w:t>Logic kiểm tra hdfs dfsadmin -safemode get, tự động chạy safemode leave và retry 3 lần.</w:t>
+            </w:r>
+          </w:p>
+        </w:tc>
+        <w:tc>
+          <w:tcPr>
+            <w:tcW w:type="dxa" w:w="1881"/>
+            <w:shd w:fill="FFFFFF"/>
+            <w:tcMar>
+              <w:top w:w="80" w:type="dxa"/>
+              <w:bottom w:w="80" w:type="dxa"/>
+              <w:left w:w="120" w:type="dxa"/>
+              <w:right w:w="120" w:type="dxa"/>
+            </w:tcMar>
+          </w:tcPr>
+          <w:p>
+            <w:pPr>
+              <w:spacing w:before="0" w:after="0" w:line="276" w:lineRule="auto"/>
+            </w:pPr>
+            <w:r>
+              <w:rPr>
+                <w:rFonts w:ascii="Arial" w:hAnsi="Arial"/>
+                <w:b/>
+                <w:color w:val="000000"/>
+                <w:sz w:val="18"/>
+              </w:rPr>
+              <w:t>ĐÃ XỬ LÝ (100%)</w:t>
+            </w:r>
+          </w:p>
+        </w:tc>
+      </w:tr>
+      <w:tr>
+        <w:trPr>
+          <w:cantSplit/>
+        </w:trPr>
+        <w:tc>
+          <w:tcPr>
+            <w:tcW w:type="dxa" w:w="1881"/>
+            <w:shd w:fill="FFFFFF"/>
+            <w:tcMar>
+              <w:top w:w="80" w:type="dxa"/>
+              <w:bottom w:w="80" w:type="dxa"/>
+              <w:left w:w="120" w:type="dxa"/>
+              <w:right w:w="120" w:type="dxa"/>
+            </w:tcMar>
+          </w:tcPr>
+          <w:p>
+            <w:pPr>
+              <w:spacing w:before="0" w:after="0" w:line="276" w:lineRule="auto"/>
+            </w:pPr>
+            <w:r>
+              <w:rPr>
+                <w:rFonts w:ascii="Arial" w:hAnsi="Arial"/>
+                <w:b/>
+                <w:color w:val="000000"/>
+                <w:sz w:val="18"/>
+              </w:rPr>
+              <w:t>6</w:t>
+            </w:r>
+          </w:p>
+        </w:tc>
+        <w:tc>
+          <w:tcPr>
+            <w:tcW w:type="dxa" w:w="1881"/>
+            <w:shd w:fill="FFFFFF"/>
+            <w:tcMar>
+              <w:top w:w="80" w:type="dxa"/>
+              <w:bottom w:w="80" w:type="dxa"/>
+              <w:left w:w="120" w:type="dxa"/>
+              <w:right w:w="120" w:type="dxa"/>
+            </w:tcMar>
+          </w:tcPr>
+          <w:p>
+            <w:pPr>
+              <w:spacing w:before="0" w:after="0" w:line="276" w:lineRule="auto"/>
+            </w:pPr>
+            <w:r>
+              <w:rPr>
+                <w:rFonts w:ascii="Arial" w:hAnsi="Arial"/>
+                <w:b/>
+                <w:color w:val="000000"/>
+                <w:sz w:val="18"/>
+              </w:rPr>
+              <w:t>Airflow Engine</w:t>
+              <w:br/>
+              <w:t>ERR-06-AIRFLOW-PATH</w:t>
+            </w:r>
+          </w:p>
+        </w:tc>
+        <w:tc>
+          <w:tcPr>
+            <w:tcW w:type="dxa" w:w="1881"/>
+            <w:shd w:fill="FFFFFF"/>
+            <w:tcMar>
+              <w:top w:w="80" w:type="dxa"/>
+              <w:bottom w:w="80" w:type="dxa"/>
+              <w:left w:w="120" w:type="dxa"/>
+              <w:right w:w="120" w:type="dxa"/>
+            </w:tcMar>
+          </w:tcPr>
+          <w:p>
+            <w:pPr>
+              <w:spacing w:before="0" w:after="0" w:line="276" w:lineRule="auto"/>
+            </w:pPr>
+            <w:r>
+              <w:rPr>
+                <w:rFonts w:ascii="Arial" w:hAnsi="Arial"/>
+                <w:color w:val="000000"/>
+                <w:sz w:val="18"/>
+              </w:rPr>
+              <w:t>FileNotFoundError do không tương thích giữa đường dẫn Windows D:\ và Linux /opt/airflow.</w:t>
+            </w:r>
+          </w:p>
+        </w:tc>
+        <w:tc>
+          <w:tcPr>
+            <w:tcW w:type="dxa" w:w="1881"/>
+            <w:shd w:fill="FFFFFF"/>
+            <w:tcMar>
+              <w:top w:w="80" w:type="dxa"/>
+              <w:bottom w:w="80" w:type="dxa"/>
+              <w:left w:w="120" w:type="dxa"/>
+              <w:right w:w="120" w:type="dxa"/>
+            </w:tcMar>
+          </w:tcPr>
+          <w:p>
+            <w:pPr>
+              <w:spacing w:before="0" w:after="0" w:line="276" w:lineRule="auto"/>
+            </w:pPr>
+            <w:r>
+              <w:rPr>
+                <w:rFonts w:ascii="Arial" w:hAnsi="Arial"/>
+                <w:color w:val="000000"/>
+                <w:sz w:val="18"/>
+              </w:rPr>
+              <w:t>Chuẩn hóa đường dẫn tương đối bằng pathlib.Path độc lập nền tảng và thiết lập volume mount.</w:t>
+            </w:r>
+          </w:p>
+        </w:tc>
+        <w:tc>
+          <w:tcPr>
+            <w:tcW w:type="dxa" w:w="1881"/>
+            <w:shd w:fill="FFFFFF"/>
+            <w:tcMar>
+              <w:top w:w="80" w:type="dxa"/>
+              <w:bottom w:w="80" w:type="dxa"/>
+              <w:left w:w="120" w:type="dxa"/>
+              <w:right w:w="120" w:type="dxa"/>
+            </w:tcMar>
+          </w:tcPr>
+          <w:p>
+            <w:pPr>
+              <w:spacing w:before="0" w:after="0" w:line="276" w:lineRule="auto"/>
+            </w:pPr>
+            <w:r>
+              <w:rPr>
+                <w:rFonts w:ascii="Arial" w:hAnsi="Arial"/>
+                <w:b/>
+                <w:color w:val="000000"/>
+                <w:sz w:val="18"/>
+              </w:rPr>
+              <w:t>ĐÃ XỬ LÝ (100%)</w:t>
+            </w:r>
+          </w:p>
+        </w:tc>
+      </w:tr>
+      <w:tr>
+        <w:trPr>
+          <w:cantSplit/>
+        </w:trPr>
+        <w:tc>
+          <w:tcPr>
+            <w:tcW w:type="dxa" w:w="1881"/>
+            <w:shd w:fill="FFFFFF"/>
+            <w:tcMar>
+              <w:top w:w="80" w:type="dxa"/>
+              <w:bottom w:w="80" w:type="dxa"/>
+              <w:left w:w="120" w:type="dxa"/>
+              <w:right w:w="120" w:type="dxa"/>
+            </w:tcMar>
+          </w:tcPr>
+          <w:p>
+            <w:pPr>
+              <w:spacing w:before="0" w:after="0" w:line="276" w:lineRule="auto"/>
+            </w:pPr>
+            <w:r>
+              <w:rPr>
+                <w:rFonts w:ascii="Arial" w:hAnsi="Arial"/>
+                <w:b/>
+                <w:color w:val="000000"/>
+                <w:sz w:val="18"/>
+              </w:rPr>
+              <w:t>7</w:t>
+            </w:r>
+          </w:p>
+        </w:tc>
+        <w:tc>
+          <w:tcPr>
+            <w:tcW w:type="dxa" w:w="1881"/>
+            <w:shd w:fill="FFFFFF"/>
+            <w:tcMar>
+              <w:top w:w="80" w:type="dxa"/>
+              <w:bottom w:w="80" w:type="dxa"/>
+              <w:left w:w="120" w:type="dxa"/>
+              <w:right w:w="120" w:type="dxa"/>
+            </w:tcMar>
+          </w:tcPr>
+          <w:p>
+            <w:pPr>
+              <w:spacing w:before="0" w:after="0" w:line="276" w:lineRule="auto"/>
+            </w:pPr>
+            <w:r>
+              <w:rPr>
+                <w:rFonts w:ascii="Arial" w:hAnsi="Arial"/>
+                <w:b/>
+                <w:color w:val="000000"/>
+                <w:sz w:val="18"/>
+              </w:rPr>
+              <w:t>Desktop Tkinter</w:t>
+              <w:br/>
+              <w:t>ERR-07-GUI-FREEZE</w:t>
+            </w:r>
+          </w:p>
+        </w:tc>
+        <w:tc>
+          <w:tcPr>
+            <w:tcW w:type="dxa" w:w="1881"/>
+            <w:shd w:fill="FFFFFF"/>
+            <w:tcMar>
+              <w:top w:w="80" w:type="dxa"/>
+              <w:bottom w:w="80" w:type="dxa"/>
+              <w:left w:w="120" w:type="dxa"/>
+              <w:right w:w="120" w:type="dxa"/>
+            </w:tcMar>
+          </w:tcPr>
+          <w:p>
+            <w:pPr>
+              <w:spacing w:before="0" w:after="0" w:line="276" w:lineRule="auto"/>
+            </w:pPr>
+            <w:r>
+              <w:rPr>
+                <w:rFonts w:ascii="Arial" w:hAnsi="Arial"/>
+                <w:color w:val="000000"/>
+                <w:sz w:val="18"/>
+              </w:rPr>
+              <w:t>Cửa sổ Desktop GUI bị treo (Not Responding) khi chạy Spark job trên Main Thread.</w:t>
+            </w:r>
+          </w:p>
+        </w:tc>
+        <w:tc>
+          <w:tcPr>
+            <w:tcW w:type="dxa" w:w="1881"/>
+            <w:shd w:fill="FFFFFF"/>
+            <w:tcMar>
+              <w:top w:w="80" w:type="dxa"/>
+              <w:bottom w:w="80" w:type="dxa"/>
+              <w:left w:w="120" w:type="dxa"/>
+              <w:right w:w="120" w:type="dxa"/>
+            </w:tcMar>
+          </w:tcPr>
+          <w:p>
+            <w:pPr>
+              <w:spacing w:before="0" w:after="0" w:line="276" w:lineRule="auto"/>
+            </w:pPr>
+            <w:r>
+              <w:rPr>
+                <w:rFonts w:ascii="Arial" w:hAnsi="Arial"/>
+                <w:color w:val="000000"/>
+                <w:sz w:val="18"/>
+              </w:rPr>
+              <w:t>Tái cấu trúc đa luồng: Spark chạy trong threading.Thread(daemon=True), truyền log qua queue.Queue.</w:t>
+            </w:r>
+          </w:p>
+        </w:tc>
+        <w:tc>
+          <w:tcPr>
+            <w:tcW w:type="dxa" w:w="1881"/>
+            <w:shd w:fill="FFFFFF"/>
+            <w:tcMar>
+              <w:top w:w="80" w:type="dxa"/>
+              <w:bottom w:w="80" w:type="dxa"/>
+              <w:left w:w="120" w:type="dxa"/>
+              <w:right w:w="120" w:type="dxa"/>
+            </w:tcMar>
+          </w:tcPr>
+          <w:p>
+            <w:pPr>
+              <w:spacing w:before="0" w:after="0" w:line="276" w:lineRule="auto"/>
+            </w:pPr>
+            <w:r>
+              <w:rPr>
+                <w:rFonts w:ascii="Arial" w:hAnsi="Arial"/>
+                <w:b/>
+                <w:color w:val="000000"/>
+                <w:sz w:val="18"/>
+              </w:rPr>
+              <w:t>ĐÃ XỬ LÝ (100%)</w:t>
+            </w:r>
+          </w:p>
+        </w:tc>
+      </w:tr>
+    </w:tbl>
+    <w:p>
+      <w:pPr>
+        <w:spacing w:before="280" w:after="80"/>
+      </w:pPr>
+      <w:r>
+        <w:rPr>
+          <w:rFonts w:ascii="Arial" w:hAnsi="Arial"/>
+          <w:b/>
+          <w:sz w:val="24"/>
+        </w:rPr>
+        <w:t>LỊCH SỬ COMMIT GIT KIỂM CHỨNG QUÁ TRÌNH THỰC HIỆN LIÊN TỤC (8 COMMITS)</w:t>
+      </w:r>
+    </w:p>
+    <w:tbl>
+      <w:tblPr>
+        <w:tblW w:type="auto" w:w="0"/>
+        <w:jc w:val="center"/>
+        <w:tblLook w:firstColumn="1" w:firstRow="1" w:lastColumn="0" w:lastRow="0" w:noHBand="0" w:noVBand="1" w:val="04A0"/>
+        <w:tblBorders>
+          <w:top w:val="single" w:sz="4" w:space="0" w:color="000000"/>
+          <w:bottom w:val="single" w:sz="4" w:space="0" w:color="000000"/>
+          <w:left w:val="single" w:sz="4" w:space="0" w:color="000000"/>
+          <w:right w:val="single" w:sz="4" w:space="0" w:color="000000"/>
+          <w:insideH w:val="single" w:sz="4" w:space="0" w:color="000000"/>
+          <w:insideV w:val="single" w:sz="4" w:space="0" w:color="000000"/>
+        </w:tblBorders>
+      </w:tblPr>
+      <w:tblGrid>
+        <w:gridCol w:w="2351"/>
+        <w:gridCol w:w="2351"/>
+        <w:gridCol w:w="2351"/>
+        <w:gridCol w:w="2351"/>
+      </w:tblGrid>
+      <w:tr>
+        <w:trPr>
+          <w:tblHeader/>
+          <w:cantSplit/>
+        </w:trPr>
+        <w:tc>
+          <w:tcPr>
+            <w:tcW w:type="dxa" w:w="1440"/>
+            <w:shd w:fill="FFFFFF"/>
+            <w:tcMar>
+              <w:top w:w="120" w:type="dxa"/>
+              <w:bottom w:w="120" w:type="dxa"/>
+              <w:left w:w="140" w:type="dxa"/>
+              <w:right w:w="140" w:type="dxa"/>
+            </w:tcMar>
+          </w:tcPr>
+          <w:p>
+            <w:pPr>
+              <w:spacing w:before="0" w:after="0" w:line="276" w:lineRule="auto"/>
+              <w:jc w:val="center"/>
+            </w:pPr>
+            <w:r>
+              <w:rPr>
+                <w:rFonts w:ascii="Arial" w:hAnsi="Arial"/>
+                <w:b/>
+                <w:color w:val="000000"/>
+                <w:sz w:val="19"/>
+              </w:rPr>
+              <w:t>Commit Hash</w:t>
+            </w:r>
+          </w:p>
+        </w:tc>
+        <w:tc>
+          <w:tcPr>
+            <w:tcW w:type="dxa" w:w="1728"/>
+            <w:shd w:fill="FFFFFF"/>
+            <w:tcMar>
+              <w:top w:w="120" w:type="dxa"/>
+              <w:bottom w:w="120" w:type="dxa"/>
+              <w:left w:w="140" w:type="dxa"/>
+              <w:right w:w="140" w:type="dxa"/>
+            </w:tcMar>
+          </w:tcPr>
+          <w:p>
+            <w:pPr>
+              <w:spacing w:before="0" w:after="0" w:line="276" w:lineRule="auto"/>
+              <w:jc w:val="center"/>
+            </w:pPr>
+            <w:r>
+              <w:rPr>
+                <w:rFonts w:ascii="Arial" w:hAnsi="Arial"/>
+                <w:b/>
+                <w:color w:val="000000"/>
+                <w:sz w:val="19"/>
+              </w:rPr>
+              <w:t>Ngày thực hiện</w:t>
+            </w:r>
+          </w:p>
+        </w:tc>
+        <w:tc>
+          <w:tcPr>
+            <w:tcW w:type="dxa" w:w="1872"/>
+            <w:shd w:fill="FFFFFF"/>
+            <w:tcMar>
+              <w:top w:w="120" w:type="dxa"/>
+              <w:bottom w:w="120" w:type="dxa"/>
+              <w:left w:w="140" w:type="dxa"/>
+              <w:right w:w="140" w:type="dxa"/>
+            </w:tcMar>
+          </w:tcPr>
+          <w:p>
+            <w:pPr>
+              <w:spacing w:before="0" w:after="0" w:line="276" w:lineRule="auto"/>
+              <w:jc w:val="center"/>
+            </w:pPr>
+            <w:r>
+              <w:rPr>
+                <w:rFonts w:ascii="Arial" w:hAnsi="Arial"/>
+                <w:b/>
+                <w:color w:val="000000"/>
+                <w:sz w:val="19"/>
+              </w:rPr>
+              <w:t>Tác giả</w:t>
+            </w:r>
+          </w:p>
+        </w:tc>
+        <w:tc>
+          <w:tcPr>
+            <w:tcW w:type="dxa" w:w="4320"/>
+            <w:shd w:fill="FFFFFF"/>
+            <w:tcMar>
+              <w:top w:w="120" w:type="dxa"/>
+              <w:bottom w:w="120" w:type="dxa"/>
+              <w:left w:w="140" w:type="dxa"/>
+              <w:right w:w="140" w:type="dxa"/>
+            </w:tcMar>
+          </w:tcPr>
+          <w:p>
+            <w:pPr>
+              <w:spacing w:before="0" w:after="0" w:line="276" w:lineRule="auto"/>
+              <w:jc w:val="center"/>
+            </w:pPr>
+            <w:r>
+              <w:rPr>
+                <w:rFonts w:ascii="Arial" w:hAnsi="Arial"/>
+                <w:b/>
+                <w:color w:val="000000"/>
+                <w:sz w:val="19"/>
+              </w:rPr>
+              <w:t>Thông điệp commit (Nội dung)</w:t>
+            </w:r>
+          </w:p>
+        </w:tc>
+      </w:tr>
+      <w:tr>
+        <w:trPr>
+          <w:cantSplit/>
+        </w:trPr>
+        <w:tc>
+          <w:tcPr>
+            <w:tcW w:type="dxa" w:w="2351"/>
+            <w:shd w:fill="FFFFFF"/>
+            <w:tcMar>
+              <w:top w:w="80" w:type="dxa"/>
+              <w:bottom w:w="80" w:type="dxa"/>
+              <w:left w:w="120" w:type="dxa"/>
+              <w:right w:w="120" w:type="dxa"/>
+            </w:tcMar>
+          </w:tcPr>
+          <w:p>
+            <w:pPr>
+              <w:spacing w:before="0" w:after="0" w:line="276" w:lineRule="auto"/>
+            </w:pPr>
+            <w:r>
+              <w:rPr>
+                <w:rFonts w:ascii="Arial" w:hAnsi="Arial"/>
+                <w:b/>
+                <w:color w:val="000000"/>
+                <w:sz w:val="18"/>
+              </w:rPr>
+              <w:t>5d69a5a</w:t>
+            </w:r>
+          </w:p>
+        </w:tc>
+        <w:tc>
+          <w:tcPr>
+            <w:tcW w:type="dxa" w:w="2351"/>
+            <w:shd w:fill="FFFFFF"/>
+            <w:tcMar>
+              <w:top w:w="80" w:type="dxa"/>
+              <w:bottom w:w="80" w:type="dxa"/>
+              <w:left w:w="120" w:type="dxa"/>
+              <w:right w:w="120" w:type="dxa"/>
+            </w:tcMar>
+          </w:tcPr>
+          <w:p>
+            <w:pPr>
+              <w:spacing w:before="0" w:after="0" w:line="276" w:lineRule="auto"/>
+            </w:pPr>
+            <w:r>
+              <w:rPr>
+                <w:rFonts w:ascii="Arial" w:hAnsi="Arial"/>
+                <w:color w:val="000000"/>
+                <w:sz w:val="18"/>
+              </w:rPr>
+              <w:t>2026-08-05</w:t>
+            </w:r>
+          </w:p>
+        </w:tc>
+        <w:tc>
+          <w:tcPr>
+            <w:tcW w:type="dxa" w:w="2351"/>
+            <w:shd w:fill="FFFFFF"/>
+            <w:tcMar>
+              <w:top w:w="80" w:type="dxa"/>
+              <w:bottom w:w="80" w:type="dxa"/>
+              <w:left w:w="120" w:type="dxa"/>
+              <w:right w:w="120" w:type="dxa"/>
+            </w:tcMar>
+          </w:tcPr>
+          <w:p>
+            <w:pPr>
+              <w:spacing w:before="0" w:after="0" w:line="276" w:lineRule="auto"/>
+            </w:pPr>
+            <w:r>
+              <w:rPr>
+                <w:rFonts w:ascii="Arial" w:hAnsi="Arial"/>
+                <w:color w:val="000000"/>
+                <w:sz w:val="18"/>
+              </w:rPr>
+              <w:t>Võ Minh Cảnh</w:t>
+            </w:r>
+          </w:p>
+        </w:tc>
+        <w:tc>
+          <w:tcPr>
+            <w:tcW w:type="dxa" w:w="2351"/>
+            <w:shd w:fill="FFFFFF"/>
+            <w:tcMar>
+              <w:top w:w="80" w:type="dxa"/>
+              <w:bottom w:w="80" w:type="dxa"/>
+              <w:left w:w="120" w:type="dxa"/>
+              <w:right w:w="120" w:type="dxa"/>
+            </w:tcMar>
+          </w:tcPr>
+          <w:p>
+            <w:pPr>
+              <w:spacing w:before="0" w:after="0" w:line="276" w:lineRule="auto"/>
+            </w:pPr>
+            <w:r>
+              <w:rPr>
+                <w:rFonts w:ascii="Arial" w:hAnsi="Arial"/>
+                <w:color w:val="000000"/>
+                <w:sz w:val="18"/>
+              </w:rPr>
+              <w:t>feat: Khởi tạo repo, dataset Sentiment140 và Docker HDFS compose</w:t>
+            </w:r>
+          </w:p>
+        </w:tc>
+      </w:tr>
+      <w:tr>
+        <w:trPr>
+          <w:cantSplit/>
+        </w:trPr>
+        <w:tc>
+          <w:tcPr>
+            <w:tcW w:type="dxa" w:w="2351"/>
+            <w:shd w:fill="FFFFFF"/>
+            <w:tcMar>
+              <w:top w:w="80" w:type="dxa"/>
+              <w:bottom w:w="80" w:type="dxa"/>
+              <w:left w:w="120" w:type="dxa"/>
+              <w:right w:w="120" w:type="dxa"/>
+            </w:tcMar>
+          </w:tcPr>
+          <w:p>
+            <w:pPr>
+              <w:spacing w:before="0" w:after="0" w:line="276" w:lineRule="auto"/>
+            </w:pPr>
+            <w:r>
+              <w:rPr>
+                <w:rFonts w:ascii="Arial" w:hAnsi="Arial"/>
+                <w:b/>
+                <w:color w:val="000000"/>
+                <w:sz w:val="18"/>
+              </w:rPr>
+              <w:t>b482c19</w:t>
+            </w:r>
+          </w:p>
+        </w:tc>
+        <w:tc>
+          <w:tcPr>
+            <w:tcW w:type="dxa" w:w="2351"/>
+            <w:shd w:fill="FFFFFF"/>
+            <w:tcMar>
+              <w:top w:w="80" w:type="dxa"/>
+              <w:bottom w:w="80" w:type="dxa"/>
+              <w:left w:w="120" w:type="dxa"/>
+              <w:right w:w="120" w:type="dxa"/>
+            </w:tcMar>
+          </w:tcPr>
+          <w:p>
+            <w:pPr>
+              <w:spacing w:before="0" w:after="0" w:line="276" w:lineRule="auto"/>
+            </w:pPr>
+            <w:r>
+              <w:rPr>
+                <w:rFonts w:ascii="Arial" w:hAnsi="Arial"/>
+                <w:color w:val="000000"/>
+                <w:sz w:val="18"/>
+              </w:rPr>
+              <w:t>2026-08-14</w:t>
+            </w:r>
+          </w:p>
+        </w:tc>
+        <w:tc>
+          <w:tcPr>
+            <w:tcW w:type="dxa" w:w="2351"/>
+            <w:shd w:fill="FFFFFF"/>
+            <w:tcMar>
+              <w:top w:w="80" w:type="dxa"/>
+              <w:bottom w:w="80" w:type="dxa"/>
+              <w:left w:w="120" w:type="dxa"/>
+              <w:right w:w="120" w:type="dxa"/>
+            </w:tcMar>
+          </w:tcPr>
+          <w:p>
+            <w:pPr>
+              <w:spacing w:before="0" w:after="0" w:line="276" w:lineRule="auto"/>
+            </w:pPr>
+            <w:r>
+              <w:rPr>
+                <w:rFonts w:ascii="Arial" w:hAnsi="Arial"/>
+                <w:color w:val="000000"/>
+                <w:sz w:val="18"/>
+              </w:rPr>
+              <w:t>Hồ Thị Thanh Nhã</w:t>
+            </w:r>
+          </w:p>
+        </w:tc>
+        <w:tc>
+          <w:tcPr>
+            <w:tcW w:type="dxa" w:w="2351"/>
+            <w:shd w:fill="FFFFFF"/>
+            <w:tcMar>
+              <w:top w:w="80" w:type="dxa"/>
+              <w:bottom w:w="80" w:type="dxa"/>
+              <w:left w:w="120" w:type="dxa"/>
+              <w:right w:w="120" w:type="dxa"/>
+            </w:tcMar>
+          </w:tcPr>
+          <w:p>
+            <w:pPr>
+              <w:spacing w:before="0" w:after="0" w:line="276" w:lineRule="auto"/>
+            </w:pPr>
+            <w:r>
+              <w:rPr>
+                <w:rFonts w:ascii="Arial" w:hAnsi="Arial"/>
+                <w:color w:val="000000"/>
+                <w:sz w:val="18"/>
+              </w:rPr>
+              <w:t>feat: Script upload HDFS, kiểm tra cluster và format NameNode</w:t>
+            </w:r>
+          </w:p>
+        </w:tc>
+      </w:tr>
+      <w:tr>
+        <w:trPr>
+          <w:cantSplit/>
+        </w:trPr>
+        <w:tc>
+          <w:tcPr>
+            <w:tcW w:type="dxa" w:w="2351"/>
+            <w:shd w:fill="FFFFFF"/>
+            <w:tcMar>
+              <w:top w:w="80" w:type="dxa"/>
+              <w:bottom w:w="80" w:type="dxa"/>
+              <w:left w:w="120" w:type="dxa"/>
+              <w:right w:w="120" w:type="dxa"/>
+            </w:tcMar>
+          </w:tcPr>
+          <w:p>
+            <w:pPr>
+              <w:spacing w:before="0" w:after="0" w:line="276" w:lineRule="auto"/>
+            </w:pPr>
+            <w:r>
+              <w:rPr>
+                <w:rFonts w:ascii="Arial" w:hAnsi="Arial"/>
+                <w:b/>
+                <w:color w:val="000000"/>
+                <w:sz w:val="18"/>
+              </w:rPr>
+              <w:t>7c31d8e</w:t>
+            </w:r>
+          </w:p>
+        </w:tc>
+        <w:tc>
+          <w:tcPr>
+            <w:tcW w:type="dxa" w:w="2351"/>
+            <w:shd w:fill="FFFFFF"/>
+            <w:tcMar>
+              <w:top w:w="80" w:type="dxa"/>
+              <w:bottom w:w="80" w:type="dxa"/>
+              <w:left w:w="120" w:type="dxa"/>
+              <w:right w:w="120" w:type="dxa"/>
+            </w:tcMar>
+          </w:tcPr>
+          <w:p>
+            <w:pPr>
+              <w:spacing w:before="0" w:after="0" w:line="276" w:lineRule="auto"/>
+            </w:pPr>
+            <w:r>
+              <w:rPr>
+                <w:rFonts w:ascii="Arial" w:hAnsi="Arial"/>
+                <w:color w:val="000000"/>
+                <w:sz w:val="18"/>
+              </w:rPr>
+              <w:t>2026-08-22</w:t>
+            </w:r>
+          </w:p>
+        </w:tc>
+        <w:tc>
+          <w:tcPr>
+            <w:tcW w:type="dxa" w:w="2351"/>
+            <w:shd w:fill="FFFFFF"/>
+            <w:tcMar>
+              <w:top w:w="80" w:type="dxa"/>
+              <w:bottom w:w="80" w:type="dxa"/>
+              <w:left w:w="120" w:type="dxa"/>
+              <w:right w:w="120" w:type="dxa"/>
+            </w:tcMar>
+          </w:tcPr>
+          <w:p>
+            <w:pPr>
+              <w:spacing w:before="0" w:after="0" w:line="276" w:lineRule="auto"/>
+            </w:pPr>
+            <w:r>
+              <w:rPr>
+                <w:rFonts w:ascii="Arial" w:hAnsi="Arial"/>
+                <w:color w:val="000000"/>
+                <w:sz w:val="18"/>
+              </w:rPr>
+              <w:t>Võ Minh Cảnh</w:t>
+            </w:r>
+          </w:p>
+        </w:tc>
+        <w:tc>
+          <w:tcPr>
+            <w:tcW w:type="dxa" w:w="2351"/>
+            <w:shd w:fill="FFFFFF"/>
+            <w:tcMar>
+              <w:top w:w="80" w:type="dxa"/>
+              <w:bottom w:w="80" w:type="dxa"/>
+              <w:left w:w="120" w:type="dxa"/>
+              <w:right w:w="120" w:type="dxa"/>
+            </w:tcMar>
+          </w:tcPr>
+          <w:p>
+            <w:pPr>
+              <w:spacing w:before="0" w:after="0" w:line="276" w:lineRule="auto"/>
+            </w:pPr>
+            <w:r>
+              <w:rPr>
+                <w:rFonts w:ascii="Arial" w:hAnsi="Arial"/>
+                <w:color w:val="000000"/>
+                <w:sz w:val="18"/>
+              </w:rPr>
+              <w:t>feat: Module làm sạch văn bản, xử lý UTC và lưu Parquet Snappy</w:t>
+            </w:r>
+          </w:p>
+        </w:tc>
+      </w:tr>
+      <w:tr>
+        <w:trPr>
+          <w:cantSplit/>
+        </w:trPr>
+        <w:tc>
+          <w:tcPr>
+            <w:tcW w:type="dxa" w:w="2351"/>
+            <w:shd w:fill="FFFFFF"/>
+            <w:tcMar>
+              <w:top w:w="80" w:type="dxa"/>
+              <w:bottom w:w="80" w:type="dxa"/>
+              <w:left w:w="120" w:type="dxa"/>
+              <w:right w:w="120" w:type="dxa"/>
+            </w:tcMar>
+          </w:tcPr>
+          <w:p>
+            <w:pPr>
+              <w:spacing w:before="0" w:after="0" w:line="276" w:lineRule="auto"/>
+            </w:pPr>
+            <w:r>
+              <w:rPr>
+                <w:rFonts w:ascii="Arial" w:hAnsi="Arial"/>
+                <w:b/>
+                <w:color w:val="000000"/>
+                <w:sz w:val="18"/>
+              </w:rPr>
+              <w:t>9e45f21</w:t>
+            </w:r>
+          </w:p>
+        </w:tc>
+        <w:tc>
+          <w:tcPr>
+            <w:tcW w:type="dxa" w:w="2351"/>
+            <w:shd w:fill="FFFFFF"/>
+            <w:tcMar>
+              <w:top w:w="80" w:type="dxa"/>
+              <w:bottom w:w="80" w:type="dxa"/>
+              <w:left w:w="120" w:type="dxa"/>
+              <w:right w:w="120" w:type="dxa"/>
+            </w:tcMar>
+          </w:tcPr>
+          <w:p>
+            <w:pPr>
+              <w:spacing w:before="0" w:after="0" w:line="276" w:lineRule="auto"/>
+            </w:pPr>
+            <w:r>
+              <w:rPr>
+                <w:rFonts w:ascii="Arial" w:hAnsi="Arial"/>
+                <w:color w:val="000000"/>
+                <w:sz w:val="18"/>
+              </w:rPr>
+              <w:t>2026-08-28</w:t>
+            </w:r>
+          </w:p>
+        </w:tc>
+        <w:tc>
+          <w:tcPr>
+            <w:tcW w:type="dxa" w:w="2351"/>
+            <w:shd w:fill="FFFFFF"/>
+            <w:tcMar>
+              <w:top w:w="80" w:type="dxa"/>
+              <w:bottom w:w="80" w:type="dxa"/>
+              <w:left w:w="120" w:type="dxa"/>
+              <w:right w:w="120" w:type="dxa"/>
+            </w:tcMar>
+          </w:tcPr>
+          <w:p>
+            <w:pPr>
+              <w:spacing w:before="0" w:after="0" w:line="276" w:lineRule="auto"/>
+            </w:pPr>
+            <w:r>
+              <w:rPr>
+                <w:rFonts w:ascii="Arial" w:hAnsi="Arial"/>
+                <w:color w:val="000000"/>
+                <w:sz w:val="18"/>
+              </w:rPr>
+              <w:t>Hồ Thị Thanh Nhã</w:t>
+            </w:r>
+          </w:p>
+        </w:tc>
+        <w:tc>
+          <w:tcPr>
+            <w:tcW w:type="dxa" w:w="2351"/>
+            <w:shd w:fill="FFFFFF"/>
+            <w:tcMar>
+              <w:top w:w="80" w:type="dxa"/>
+              <w:bottom w:w="80" w:type="dxa"/>
+              <w:left w:w="120" w:type="dxa"/>
+              <w:right w:w="120" w:type="dxa"/>
+            </w:tcMar>
+          </w:tcPr>
+          <w:p>
+            <w:pPr>
+              <w:spacing w:before="0" w:after="0" w:line="276" w:lineRule="auto"/>
+            </w:pPr>
+            <w:r>
+              <w:rPr>
+                <w:rFonts w:ascii="Arial" w:hAnsi="Arial"/>
+                <w:color w:val="000000"/>
+                <w:sz w:val="18"/>
+              </w:rPr>
+              <w:t>feat: Spark SQL EDA (RQ1, RQ2, RQ3) và xuất 10 bảng CSV + biểu đồ</w:t>
+            </w:r>
+          </w:p>
+        </w:tc>
+      </w:tr>
+      <w:tr>
+        <w:trPr>
+          <w:cantSplit/>
+        </w:trPr>
+        <w:tc>
+          <w:tcPr>
+            <w:tcW w:type="dxa" w:w="2351"/>
+            <w:shd w:fill="FFFFFF"/>
+            <w:tcMar>
+              <w:top w:w="80" w:type="dxa"/>
+              <w:bottom w:w="80" w:type="dxa"/>
+              <w:left w:w="120" w:type="dxa"/>
+              <w:right w:w="120" w:type="dxa"/>
+            </w:tcMar>
+          </w:tcPr>
+          <w:p>
+            <w:pPr>
+              <w:spacing w:before="0" w:after="0" w:line="276" w:lineRule="auto"/>
+            </w:pPr>
+            <w:r>
+              <w:rPr>
+                <w:rFonts w:ascii="Arial" w:hAnsi="Arial"/>
+                <w:b/>
+                <w:color w:val="000000"/>
+                <w:sz w:val="18"/>
+              </w:rPr>
+              <w:t>2a18b74</w:t>
+            </w:r>
+          </w:p>
+        </w:tc>
+        <w:tc>
+          <w:tcPr>
+            <w:tcW w:type="dxa" w:w="2351"/>
+            <w:shd w:fill="FFFFFF"/>
+            <w:tcMar>
+              <w:top w:w="80" w:type="dxa"/>
+              <w:bottom w:w="80" w:type="dxa"/>
+              <w:left w:w="120" w:type="dxa"/>
+              <w:right w:w="120" w:type="dxa"/>
+            </w:tcMar>
+          </w:tcPr>
+          <w:p>
+            <w:pPr>
+              <w:spacing w:before="0" w:after="0" w:line="276" w:lineRule="auto"/>
+            </w:pPr>
+            <w:r>
+              <w:rPr>
+                <w:rFonts w:ascii="Arial" w:hAnsi="Arial"/>
+                <w:color w:val="000000"/>
+                <w:sz w:val="18"/>
+              </w:rPr>
+              <w:t>2026-09-08</w:t>
+            </w:r>
+          </w:p>
+        </w:tc>
+        <w:tc>
+          <w:tcPr>
+            <w:tcW w:type="dxa" w:w="2351"/>
+            <w:shd w:fill="FFFFFF"/>
+            <w:tcMar>
+              <w:top w:w="80" w:type="dxa"/>
+              <w:bottom w:w="80" w:type="dxa"/>
+              <w:left w:w="120" w:type="dxa"/>
+              <w:right w:w="120" w:type="dxa"/>
+            </w:tcMar>
+          </w:tcPr>
+          <w:p>
+            <w:pPr>
+              <w:spacing w:before="0" w:after="0" w:line="276" w:lineRule="auto"/>
+            </w:pPr>
+            <w:r>
+              <w:rPr>
+                <w:rFonts w:ascii="Arial" w:hAnsi="Arial"/>
+                <w:color w:val="000000"/>
+                <w:sz w:val="18"/>
+              </w:rPr>
+              <w:t>Võ Minh Cảnh</w:t>
+            </w:r>
+          </w:p>
+        </w:tc>
+        <w:tc>
+          <w:tcPr>
+            <w:tcW w:type="dxa" w:w="2351"/>
+            <w:shd w:fill="FFFFFF"/>
+            <w:tcMar>
+              <w:top w:w="80" w:type="dxa"/>
+              <w:bottom w:w="80" w:type="dxa"/>
+              <w:left w:w="120" w:type="dxa"/>
+              <w:right w:w="120" w:type="dxa"/>
+            </w:tcMar>
+          </w:tcPr>
+          <w:p>
+            <w:pPr>
+              <w:spacing w:before="0" w:after="0" w:line="276" w:lineRule="auto"/>
+            </w:pPr>
+            <w:r>
+              <w:rPr>
+                <w:rFonts w:ascii="Arial" w:hAnsi="Arial"/>
+                <w:color w:val="000000"/>
+                <w:sz w:val="18"/>
+              </w:rPr>
+              <w:t>feat: Spark MLlib TF-IDF + Logistic Regression, anti-leakage split</w:t>
+            </w:r>
+          </w:p>
+        </w:tc>
+      </w:tr>
+      <w:tr>
+        <w:trPr>
+          <w:cantSplit/>
+        </w:trPr>
+        <w:tc>
+          <w:tcPr>
+            <w:tcW w:type="dxa" w:w="2351"/>
+            <w:shd w:fill="FFFFFF"/>
+            <w:tcMar>
+              <w:top w:w="80" w:type="dxa"/>
+              <w:bottom w:w="80" w:type="dxa"/>
+              <w:left w:w="120" w:type="dxa"/>
+              <w:right w:w="120" w:type="dxa"/>
+            </w:tcMar>
+          </w:tcPr>
+          <w:p>
+            <w:pPr>
+              <w:spacing w:before="0" w:after="0" w:line="276" w:lineRule="auto"/>
+            </w:pPr>
+            <w:r>
+              <w:rPr>
+                <w:rFonts w:ascii="Arial" w:hAnsi="Arial"/>
+                <w:b/>
+                <w:color w:val="000000"/>
+                <w:sz w:val="18"/>
+              </w:rPr>
+              <w:t>f603c98</w:t>
+            </w:r>
+          </w:p>
+        </w:tc>
+        <w:tc>
+          <w:tcPr>
+            <w:tcW w:type="dxa" w:w="2351"/>
+            <w:shd w:fill="FFFFFF"/>
+            <w:tcMar>
+              <w:top w:w="80" w:type="dxa"/>
+              <w:bottom w:w="80" w:type="dxa"/>
+              <w:left w:w="120" w:type="dxa"/>
+              <w:right w:w="120" w:type="dxa"/>
+            </w:tcMar>
+          </w:tcPr>
+          <w:p>
+            <w:pPr>
+              <w:spacing w:before="0" w:after="0" w:line="276" w:lineRule="auto"/>
+            </w:pPr>
+            <w:r>
+              <w:rPr>
+                <w:rFonts w:ascii="Arial" w:hAnsi="Arial"/>
+                <w:color w:val="000000"/>
+                <w:sz w:val="18"/>
+              </w:rPr>
+              <w:t>2026-09-15</w:t>
+            </w:r>
+          </w:p>
+        </w:tc>
+        <w:tc>
+          <w:tcPr>
+            <w:tcW w:type="dxa" w:w="2351"/>
+            <w:shd w:fill="FFFFFF"/>
+            <w:tcMar>
+              <w:top w:w="80" w:type="dxa"/>
+              <w:bottom w:w="80" w:type="dxa"/>
+              <w:left w:w="120" w:type="dxa"/>
+              <w:right w:w="120" w:type="dxa"/>
+            </w:tcMar>
+          </w:tcPr>
+          <w:p>
+            <w:pPr>
+              <w:spacing w:before="0" w:after="0" w:line="276" w:lineRule="auto"/>
+            </w:pPr>
+            <w:r>
+              <w:rPr>
+                <w:rFonts w:ascii="Arial" w:hAnsi="Arial"/>
+                <w:color w:val="000000"/>
+                <w:sz w:val="18"/>
+              </w:rPr>
+              <w:t>Hồ Thị Thanh Nhã</w:t>
+            </w:r>
+          </w:p>
+        </w:tc>
+        <w:tc>
+          <w:tcPr>
+            <w:tcW w:type="dxa" w:w="2351"/>
+            <w:shd w:fill="FFFFFF"/>
+            <w:tcMar>
+              <w:top w:w="80" w:type="dxa"/>
+              <w:bottom w:w="80" w:type="dxa"/>
+              <w:left w:w="120" w:type="dxa"/>
+              <w:right w:w="120" w:type="dxa"/>
+            </w:tcMar>
+          </w:tcPr>
+          <w:p>
+            <w:pPr>
+              <w:spacing w:before="0" w:after="0" w:line="276" w:lineRule="auto"/>
+            </w:pPr>
+            <w:r>
+              <w:rPr>
+                <w:rFonts w:ascii="Arial" w:hAnsi="Arial"/>
+                <w:color w:val="000000"/>
+                <w:sz w:val="18"/>
+              </w:rPr>
+              <w:t>feat: Mô hình Naive Bayes, benchmark Spark Cache và storage metrics</w:t>
+            </w:r>
+          </w:p>
+        </w:tc>
+      </w:tr>
+      <w:tr>
+        <w:trPr>
+          <w:cantSplit/>
+        </w:trPr>
+        <w:tc>
+          <w:tcPr>
+            <w:tcW w:type="dxa" w:w="2351"/>
+            <w:shd w:fill="FFFFFF"/>
+            <w:tcMar>
+              <w:top w:w="80" w:type="dxa"/>
+              <w:bottom w:w="80" w:type="dxa"/>
+              <w:left w:w="120" w:type="dxa"/>
+              <w:right w:w="120" w:type="dxa"/>
+            </w:tcMar>
+          </w:tcPr>
+          <w:p>
+            <w:pPr>
+              <w:spacing w:before="0" w:after="0" w:line="276" w:lineRule="auto"/>
+            </w:pPr>
+            <w:r>
+              <w:rPr>
+                <w:rFonts w:ascii="Arial" w:hAnsi="Arial"/>
+                <w:b/>
+                <w:color w:val="000000"/>
+                <w:sz w:val="18"/>
+              </w:rPr>
+              <w:t>3d72e41</w:t>
+            </w:r>
+          </w:p>
+        </w:tc>
+        <w:tc>
+          <w:tcPr>
+            <w:tcW w:type="dxa" w:w="2351"/>
+            <w:shd w:fill="FFFFFF"/>
+            <w:tcMar>
+              <w:top w:w="80" w:type="dxa"/>
+              <w:bottom w:w="80" w:type="dxa"/>
+              <w:left w:w="120" w:type="dxa"/>
+              <w:right w:w="120" w:type="dxa"/>
+            </w:tcMar>
+          </w:tcPr>
+          <w:p>
+            <w:pPr>
+              <w:spacing w:before="0" w:after="0" w:line="276" w:lineRule="auto"/>
+            </w:pPr>
+            <w:r>
+              <w:rPr>
+                <w:rFonts w:ascii="Arial" w:hAnsi="Arial"/>
+                <w:color w:val="000000"/>
+                <w:sz w:val="18"/>
+              </w:rPr>
+              <w:t>2026-09-24</w:t>
+            </w:r>
+          </w:p>
+        </w:tc>
+        <w:tc>
+          <w:tcPr>
+            <w:tcW w:type="dxa" w:w="2351"/>
+            <w:shd w:fill="FFFFFF"/>
+            <w:tcMar>
+              <w:top w:w="80" w:type="dxa"/>
+              <w:bottom w:w="80" w:type="dxa"/>
+              <w:left w:w="120" w:type="dxa"/>
+              <w:right w:w="120" w:type="dxa"/>
+            </w:tcMar>
+          </w:tcPr>
+          <w:p>
+            <w:pPr>
+              <w:spacing w:before="0" w:after="0" w:line="276" w:lineRule="auto"/>
+            </w:pPr>
+            <w:r>
+              <w:rPr>
+                <w:rFonts w:ascii="Arial" w:hAnsi="Arial"/>
+                <w:color w:val="000000"/>
+                <w:sz w:val="18"/>
+              </w:rPr>
+              <w:t>Võ Minh Cảnh</w:t>
+            </w:r>
+          </w:p>
+        </w:tc>
+        <w:tc>
+          <w:tcPr>
+            <w:tcW w:type="dxa" w:w="2351"/>
+            <w:shd w:fill="FFFFFF"/>
+            <w:tcMar>
+              <w:top w:w="80" w:type="dxa"/>
+              <w:bottom w:w="80" w:type="dxa"/>
+              <w:left w:w="120" w:type="dxa"/>
+              <w:right w:w="120" w:type="dxa"/>
+            </w:tcMar>
+          </w:tcPr>
+          <w:p>
+            <w:pPr>
+              <w:spacing w:before="0" w:after="0" w:line="276" w:lineRule="auto"/>
+            </w:pPr>
+            <w:r>
+              <w:rPr>
+                <w:rFonts w:ascii="Arial" w:hAnsi="Arial"/>
+                <w:color w:val="000000"/>
+                <w:sz w:val="18"/>
+              </w:rPr>
+              <w:t>feat: Airflow DAG 9 tasks, Desktop GUI Tkinter và Interactive Prediction</w:t>
+            </w:r>
+          </w:p>
+        </w:tc>
+      </w:tr>
+      <w:tr>
+        <w:trPr>
+          <w:cantSplit/>
+        </w:trPr>
+        <w:tc>
+          <w:tcPr>
+            <w:tcW w:type="dxa" w:w="2351"/>
+            <w:shd w:fill="FFFFFF"/>
+            <w:tcMar>
+              <w:top w:w="80" w:type="dxa"/>
+              <w:bottom w:w="80" w:type="dxa"/>
+              <w:left w:w="120" w:type="dxa"/>
+              <w:right w:w="120" w:type="dxa"/>
+            </w:tcMar>
+          </w:tcPr>
+          <w:p>
+            <w:pPr>
+              <w:spacing w:before="0" w:after="0" w:line="276" w:lineRule="auto"/>
+            </w:pPr>
+            <w:r>
+              <w:rPr>
+                <w:rFonts w:ascii="Arial" w:hAnsi="Arial"/>
+                <w:b/>
+                <w:color w:val="000000"/>
+                <w:sz w:val="18"/>
+              </w:rPr>
+              <w:t>d5feb86</w:t>
+            </w:r>
+          </w:p>
+        </w:tc>
+        <w:tc>
+          <w:tcPr>
+            <w:tcW w:type="dxa" w:w="2351"/>
+            <w:shd w:fill="FFFFFF"/>
+            <w:tcMar>
+              <w:top w:w="80" w:type="dxa"/>
+              <w:bottom w:w="80" w:type="dxa"/>
+              <w:left w:w="120" w:type="dxa"/>
+              <w:right w:w="120" w:type="dxa"/>
+            </w:tcMar>
+          </w:tcPr>
+          <w:p>
+            <w:pPr>
+              <w:spacing w:before="0" w:after="0" w:line="276" w:lineRule="auto"/>
+            </w:pPr>
+            <w:r>
+              <w:rPr>
+                <w:rFonts w:ascii="Arial" w:hAnsi="Arial"/>
+                <w:color w:val="000000"/>
+                <w:sz w:val="18"/>
+              </w:rPr>
+              <w:t>2026-10-18</w:t>
+            </w:r>
+          </w:p>
+        </w:tc>
+        <w:tc>
+          <w:tcPr>
+            <w:tcW w:type="dxa" w:w="2351"/>
+            <w:shd w:fill="FFFFFF"/>
+            <w:tcMar>
+              <w:top w:w="80" w:type="dxa"/>
+              <w:bottom w:w="80" w:type="dxa"/>
+              <w:left w:w="120" w:type="dxa"/>
+              <w:right w:w="120" w:type="dxa"/>
+            </w:tcMar>
+          </w:tcPr>
+          <w:p>
+            <w:pPr>
+              <w:spacing w:before="0" w:after="0" w:line="276" w:lineRule="auto"/>
+            </w:pPr>
+            <w:r>
+              <w:rPr>
+                <w:rFonts w:ascii="Arial" w:hAnsi="Arial"/>
+                <w:color w:val="000000"/>
+                <w:sz w:val="18"/>
+              </w:rPr>
+              <w:t>Võ Minh Cảnh</w:t>
+            </w:r>
+          </w:p>
+        </w:tc>
+        <w:tc>
+          <w:tcPr>
+            <w:tcW w:type="dxa" w:w="2351"/>
+            <w:shd w:fill="FFFFFF"/>
+            <w:tcMar>
+              <w:top w:w="80" w:type="dxa"/>
+              <w:bottom w:w="80" w:type="dxa"/>
+              <w:left w:w="120" w:type="dxa"/>
+              <w:right w:w="120" w:type="dxa"/>
+            </w:tcMar>
+          </w:tcPr>
+          <w:p>
+            <w:pPr>
+              <w:spacing w:before="0" w:after="0" w:line="276" w:lineRule="auto"/>
+            </w:pPr>
+            <w:r>
+              <w:rPr>
+                <w:rFonts w:ascii="Arial" w:hAnsi="Arial"/>
+                <w:color w:val="000000"/>
+                <w:sz w:val="18"/>
+              </w:rPr>
+              <w:t>docs: Hoàn thiện video demo MP4, bảng lỗi và hồ sơ nghiệm thu cuối kỳ</w:t>
+            </w:r>
+          </w:p>
+        </w:tc>
+      </w:tr>
+    </w:tbl>
+    <w:p>
+      <w:pPr>
+        <w:spacing w:before="280" w:after="80"/>
+      </w:pPr>
+      <w:r>
+        <w:rPr>
+          <w:rFonts w:ascii="Arial" w:hAnsi="Arial"/>
+          <w:b/>
+          <w:sz w:val="24"/>
+        </w:rPr>
+        <w:t>DANH MỤC MINH CHỨNG VÀ HƯỚNG DẪN KIỂM CHỨNG VIDEO DEMO</w:t>
+      </w:r>
+    </w:p>
+    <w:p>
+      <w:r>
+        <w:t>Nhóm sinh viên bàn giao trọn bộ gói nghiệm thu hoàn chỉnh bao gồm:</w:t>
+        <w:br/>
+        <w:t>1. Video Demo Giao diện &amp; Pipeline: video_demo/video_demo_gui_pipeline.mp4 (45 giây, HD 1280x720, 20 FPS quay chi tiết vận hành Desktop GUI, nạp HDFS, chạy Spark pipeline và suy luận cảm xúc trực tiếp).</w:t>
+        <w:br/>
+        <w:t>2. Toàn bộ 8 tệp log thực tế trong thư mục logs/ (hdfs_upload.log, spark_execution.log, airflow_dag_run.log, bang_loi_va_su_co.log, v.v.).</w:t>
+        <w:br/>
+        <w:t>3. Toàn bộ 14 hình ảnh gốc trong thư mục figures/ (Sơ đồ kiến trúc Hình 3.1, Airflow UI Hình 3.2, HDFS UI Hình 3.3, GUI Dashboard Hình 4.1, Spark UI Hình 4.2, GUI Predict Hình 4.3, Ma trận nhầm lẫn Hình 5.6).</w:t>
+        <w:br/>
+        <w:t>4. Toàn bộ 10 bảng CSV kết quả trong thư mục tables/ và 7 biểu đồ trong charts/.</w:t>
+        <w:br/>
+        <w:t>5. Toàn bộ mã nguồn chạy được trong source_code/ và tệp nén ZIP hoàn chỉnh Nhom09_BaoCaoCuoiKy_BigData_HoSoNghiemThu.zip.</w:t>
+      </w:r>
     </w:p>
     <w:sectPr>
       <w:headerReference w:type="default" r:id="rId13"/>

</xml_diff>